<commit_message>
docs: finalize cde submission package
</commit_message>
<xml_diff>
--- a/docs/cde_2026_paper_final_ko.docx
+++ b/docs/cde_2026_paper_final_ko.docx
@@ -360,8 +360,8 @@
           <w:headerReference w:type="default" r:id="rId9"/>
           <w:footerReference w:type="default" r:id="rId10"/>
           <w:footerReference w:type="first" r:id="rId11"/>
-          <w:headerReference w:type="first" r:id="rId18"/>
-          <w:footerReference w:type="even" r:id="rId19"/>
+          <w:footerReference w:type="even" r:id="rId18"/>
+          <w:headerReference w:type="first" r:id="rId19"/>
           <w:type w:val="continuous"/>
           <w:pgSz w:w="11906" w:h="16838"/>
           <w:pgMar w:top="851" w:right="1134" w:bottom="851" w:left="1134" w:header="340" w:footer="454" w:gutter="0"/>
@@ -374,6 +374,7 @@
     <w:p>
       <w:pPr>
         <w:pStyle w:val="af1"/>
+        <w:keepNext/>
         <w:spacing w:after="100" w:line="252" w:lineRule="auto" w:before="100"/>
       </w:pPr>
       <w:r>
@@ -464,6 +465,7 @@
     <w:p>
       <w:pPr>
         <w:pStyle w:val="af1"/>
+        <w:keepNext/>
         <w:spacing w:after="100" w:line="252" w:lineRule="auto" w:before="100"/>
       </w:pPr>
       <w:r>
@@ -577,6 +579,7 @@
     <w:p>
       <w:pPr>
         <w:pStyle w:val="af1"/>
+        <w:keepNext/>
         <w:spacing w:after="100" w:line="252" w:lineRule="auto" w:before="100"/>
       </w:pPr>
       <w:r>
@@ -633,9 +636,9 @@
     <w:tbl>
       <w:tblPr>
         <w:tblStyle w:val="af4"/>
-        <w:tblW w:type="auto" w:w="0"/>
+        <w:tblW w:type="dxa" w:w="4176"/>
         <w:jc w:val="center"/>
-        <w:tblLayout w:type="autofit"/>
+        <w:tblLayout w:type="fixed"/>
         <w:tblLook w:firstColumn="1" w:firstRow="1" w:lastColumn="0" w:lastRow="0" w:noHBand="0" w:noVBand="1" w:val="04A0"/>
       </w:tblPr>
       <w:tblGrid>
@@ -648,7 +651,7 @@
         </w:trPr>
         <w:tc>
           <w:tcPr>
-            <w:tcW w:type="dxa" w:w="4819"/>
+            <w:tcW w:type="dxa" w:w="1123"/>
             <w:vAlign w:val="center"/>
             <w:shd w:fill="E9EEF4"/>
           </w:tcPr>
@@ -661,7 +664,7 @@
               <w:rPr>
                 <w:rFonts w:ascii="Times New Roman" w:hAnsi="Times New Roman" w:eastAsia="Times New Roman"/>
                 <w:b/>
-                <w:sz w:val="13"/>
+                <w:sz w:val="11"/>
               </w:rPr>
               <w:t>Item</w:t>
             </w:r>
@@ -669,7 +672,7 @@
         </w:tc>
         <w:tc>
           <w:tcPr>
-            <w:tcW w:type="dxa" w:w="4819"/>
+            <w:tcW w:type="dxa" w:w="3052"/>
             <w:vAlign w:val="center"/>
             <w:shd w:fill="E9EEF4"/>
           </w:tcPr>
@@ -682,7 +685,7 @@
               <w:rPr>
                 <w:rFonts w:ascii="Times New Roman" w:hAnsi="Times New Roman" w:eastAsia="Times New Roman"/>
                 <w:b/>
-                <w:sz w:val="13"/>
+                <w:sz w:val="11"/>
               </w:rPr>
               <w:t>Setting</w:t>
             </w:r>
@@ -692,19 +695,19 @@
       <w:tr>
         <w:tc>
           <w:tcPr>
-            <w:tcW w:type="dxa" w:w="4819"/>
-            <w:vAlign w:val="center"/>
-          </w:tcPr>
-          <w:p>
-            <w:pPr>
-              <w:spacing w:after="0" w:line="240" w:lineRule="auto"/>
-              <w:jc w:val="center"/>
-            </w:pPr>
-            <w:r>
-              <w:rPr>
-                <w:rFonts w:ascii="Times New Roman" w:hAnsi="Times New Roman" w:eastAsia="Times New Roman"/>
-                <w:b w:val="0"/>
-                <w:sz w:val="13"/>
+            <w:tcW w:type="dxa" w:w="1123"/>
+            <w:vAlign w:val="center"/>
+          </w:tcPr>
+          <w:p>
+            <w:pPr>
+              <w:spacing w:after="0" w:line="240" w:lineRule="auto"/>
+              <w:jc w:val="center"/>
+            </w:pPr>
+            <w:r>
+              <w:rPr>
+                <w:rFonts w:ascii="Times New Roman" w:hAnsi="Times New Roman" w:eastAsia="Times New Roman"/>
+                <w:b w:val="0"/>
+                <w:sz w:val="11"/>
               </w:rPr>
               <w:t>Theme scope</w:t>
             </w:r>
@@ -712,19 +715,19 @@
         </w:tc>
         <w:tc>
           <w:tcPr>
-            <w:tcW w:type="dxa" w:w="4819"/>
-            <w:vAlign w:val="center"/>
-          </w:tcPr>
-          <w:p>
-            <w:pPr>
-              <w:spacing w:after="0" w:line="240" w:lineRule="auto"/>
-              <w:jc w:val="center"/>
-            </w:pPr>
-            <w:r>
-              <w:rPr>
-                <w:rFonts w:ascii="Times New Roman" w:hAnsi="Times New Roman" w:eastAsia="Times New Roman"/>
-                <w:b w:val="0"/>
-                <w:sz w:val="13"/>
+            <w:tcW w:type="dxa" w:w="3052"/>
+            <w:vAlign w:val="center"/>
+          </w:tcPr>
+          <w:p>
+            <w:pPr>
+              <w:spacing w:after="0" w:line="240" w:lineRule="auto"/>
+              <w:jc w:val="center"/>
+            </w:pPr>
+            <w:r>
+              <w:rPr>
+                <w:rFonts w:ascii="Times New Roman" w:hAnsi="Times New Roman" w:eastAsia="Times New Roman"/>
+                <w:b w:val="0"/>
+                <w:sz w:val="11"/>
               </w:rPr>
               <w:t>AI industry theme candidate selection</w:t>
             </w:r>
@@ -734,19 +737,19 @@
       <w:tr>
         <w:tc>
           <w:tcPr>
-            <w:tcW w:type="dxa" w:w="4819"/>
-            <w:vAlign w:val="center"/>
-          </w:tcPr>
-          <w:p>
-            <w:pPr>
-              <w:spacing w:after="0" w:line="240" w:lineRule="auto"/>
-              <w:jc w:val="center"/>
-            </w:pPr>
-            <w:r>
-              <w:rPr>
-                <w:rFonts w:ascii="Times New Roman" w:hAnsi="Times New Roman" w:eastAsia="Times New Roman"/>
-                <w:b w:val="0"/>
-                <w:sz w:val="13"/>
+            <w:tcW w:type="dxa" w:w="1123"/>
+            <w:vAlign w:val="center"/>
+          </w:tcPr>
+          <w:p>
+            <w:pPr>
+              <w:spacing w:after="0" w:line="240" w:lineRule="auto"/>
+              <w:jc w:val="center"/>
+            </w:pPr>
+            <w:r>
+              <w:rPr>
+                <w:rFonts w:ascii="Times New Roman" w:hAnsi="Times New Roman" w:eastAsia="Times New Roman"/>
+                <w:b w:val="0"/>
+                <w:sz w:val="11"/>
               </w:rPr>
               <w:t>Periods</w:t>
             </w:r>
@@ -754,19 +757,19 @@
         </w:tc>
         <w:tc>
           <w:tcPr>
-            <w:tcW w:type="dxa" w:w="4819"/>
-            <w:vAlign w:val="center"/>
-          </w:tcPr>
-          <w:p>
-            <w:pPr>
-              <w:spacing w:after="0" w:line="240" w:lineRule="auto"/>
-              <w:jc w:val="center"/>
-            </w:pPr>
-            <w:r>
-              <w:rPr>
-                <w:rFonts w:ascii="Times New Roman" w:hAnsi="Times New Roman" w:eastAsia="Times New Roman"/>
-                <w:b w:val="0"/>
-                <w:sz w:val="13"/>
+            <w:tcW w:type="dxa" w:w="3052"/>
+            <w:vAlign w:val="center"/>
+          </w:tcPr>
+          <w:p>
+            <w:pPr>
+              <w:spacing w:after="0" w:line="240" w:lineRule="auto"/>
+              <w:jc w:val="center"/>
+            </w:pPr>
+            <w:r>
+              <w:rPr>
+                <w:rFonts w:ascii="Times New Roman" w:hAnsi="Times New Roman" w:eastAsia="Times New Roman"/>
+                <w:b w:val="0"/>
+                <w:sz w:val="11"/>
               </w:rPr>
               <w:t>Validation: 2023, 2024, 2026Q1; tuning/reference: 2025</w:t>
             </w:r>
@@ -776,19 +779,19 @@
       <w:tr>
         <w:tc>
           <w:tcPr>
-            <w:tcW w:type="dxa" w:w="4819"/>
-            <w:vAlign w:val="center"/>
-          </w:tcPr>
-          <w:p>
-            <w:pPr>
-              <w:spacing w:after="0" w:line="240" w:lineRule="auto"/>
-              <w:jc w:val="center"/>
-            </w:pPr>
-            <w:r>
-              <w:rPr>
-                <w:rFonts w:ascii="Times New Roman" w:hAnsi="Times New Roman" w:eastAsia="Times New Roman"/>
-                <w:b w:val="0"/>
-                <w:sz w:val="13"/>
+            <w:tcW w:type="dxa" w:w="1123"/>
+            <w:vAlign w:val="center"/>
+          </w:tcPr>
+          <w:p>
+            <w:pPr>
+              <w:spacing w:after="0" w:line="240" w:lineRule="auto"/>
+              <w:jc w:val="center"/>
+            </w:pPr>
+            <w:r>
+              <w:rPr>
+                <w:rFonts w:ascii="Times New Roman" w:hAnsi="Times New Roman" w:eastAsia="Times New Roman"/>
+                <w:b w:val="0"/>
+                <w:sz w:val="11"/>
               </w:rPr>
               <w:t>Horizons</w:t>
             </w:r>
@@ -796,19 +799,19 @@
         </w:tc>
         <w:tc>
           <w:tcPr>
-            <w:tcW w:type="dxa" w:w="4819"/>
-            <w:vAlign w:val="center"/>
-          </w:tcPr>
-          <w:p>
-            <w:pPr>
-              <w:spacing w:after="0" w:line="240" w:lineRule="auto"/>
-              <w:jc w:val="center"/>
-            </w:pPr>
-            <w:r>
-              <w:rPr>
-                <w:rFonts w:ascii="Times New Roman" w:hAnsi="Times New Roman" w:eastAsia="Times New Roman"/>
-                <w:b w:val="0"/>
-                <w:sz w:val="13"/>
+            <w:tcW w:type="dxa" w:w="3052"/>
+            <w:vAlign w:val="center"/>
+          </w:tcPr>
+          <w:p>
+            <w:pPr>
+              <w:spacing w:after="0" w:line="240" w:lineRule="auto"/>
+              <w:jc w:val="center"/>
+            </w:pPr>
+            <w:r>
+              <w:rPr>
+                <w:rFonts w:ascii="Times New Roman" w:hAnsi="Times New Roman" w:eastAsia="Times New Roman"/>
+                <w:b w:val="0"/>
+                <w:sz w:val="11"/>
               </w:rPr>
               <w:t>Short: 5 trading days, Long: 60 trading days</w:t>
             </w:r>
@@ -818,19 +821,19 @@
       <w:tr>
         <w:tc>
           <w:tcPr>
-            <w:tcW w:type="dxa" w:w="4819"/>
-            <w:vAlign w:val="center"/>
-          </w:tcPr>
-          <w:p>
-            <w:pPr>
-              <w:spacing w:after="0" w:line="240" w:lineRule="auto"/>
-              <w:jc w:val="center"/>
-            </w:pPr>
-            <w:r>
-              <w:rPr>
-                <w:rFonts w:ascii="Times New Roman" w:hAnsi="Times New Roman" w:eastAsia="Times New Roman"/>
-                <w:b w:val="0"/>
-                <w:sz w:val="13"/>
+            <w:tcW w:type="dxa" w:w="1123"/>
+            <w:vAlign w:val="center"/>
+          </w:tcPr>
+          <w:p>
+            <w:pPr>
+              <w:spacing w:after="0" w:line="240" w:lineRule="auto"/>
+              <w:jc w:val="center"/>
+            </w:pPr>
+            <w:r>
+              <w:rPr>
+                <w:rFonts w:ascii="Times New Roman" w:hAnsi="Times New Roman" w:eastAsia="Times New Roman"/>
+                <w:b w:val="0"/>
+                <w:sz w:val="11"/>
               </w:rPr>
               <w:t>Comparators</w:t>
             </w:r>
@@ -838,19 +841,19 @@
         </w:tc>
         <w:tc>
           <w:tcPr>
-            <w:tcW w:type="dxa" w:w="4819"/>
-            <w:vAlign w:val="center"/>
-          </w:tcPr>
-          <w:p>
-            <w:pPr>
-              <w:spacing w:after="0" w:line="240" w:lineRule="auto"/>
-              <w:jc w:val="center"/>
-            </w:pPr>
-            <w:r>
-              <w:rPr>
-                <w:rFonts w:ascii="Times New Roman" w:hAnsi="Times New Roman" w:eastAsia="Times New Roman"/>
-                <w:b w:val="0"/>
-                <w:sz w:val="13"/>
+            <w:tcW w:type="dxa" w:w="3052"/>
+            <w:vAlign w:val="center"/>
+          </w:tcPr>
+          <w:p>
+            <w:pPr>
+              <w:spacing w:after="0" w:line="240" w:lineRule="auto"/>
+              <w:jc w:val="center"/>
+            </w:pPr>
+            <w:r>
+              <w:rPr>
+                <w:rFonts w:ascii="Times New Roman" w:hAnsi="Times New Roman" w:eastAsia="Times New Roman"/>
+                <w:b w:val="0"/>
+                <w:sz w:val="11"/>
               </w:rPr>
               <w:t>Deterministic, RSI, Bollinger Band, momentum, LLM-only, hybrid multi-agent</w:t>
             </w:r>
@@ -860,19 +863,19 @@
       <w:tr>
         <w:tc>
           <w:tcPr>
-            <w:tcW w:type="dxa" w:w="4819"/>
-            <w:vAlign w:val="center"/>
-          </w:tcPr>
-          <w:p>
-            <w:pPr>
-              <w:spacing w:after="0" w:line="240" w:lineRule="auto"/>
-              <w:jc w:val="center"/>
-            </w:pPr>
-            <w:r>
-              <w:rPr>
-                <w:rFonts w:ascii="Times New Roman" w:hAnsi="Times New Roman" w:eastAsia="Times New Roman"/>
-                <w:b w:val="0"/>
-                <w:sz w:val="13"/>
+            <w:tcW w:type="dxa" w:w="1123"/>
+            <w:vAlign w:val="center"/>
+          </w:tcPr>
+          <w:p>
+            <w:pPr>
+              <w:spacing w:after="0" w:line="240" w:lineRule="auto"/>
+              <w:jc w:val="center"/>
+            </w:pPr>
+            <w:r>
+              <w:rPr>
+                <w:rFonts w:ascii="Times New Roman" w:hAnsi="Times New Roman" w:eastAsia="Times New Roman"/>
+                <w:b w:val="0"/>
+                <w:sz w:val="11"/>
               </w:rPr>
               <w:t>Cost assumptions</w:t>
             </w:r>
@@ -880,19 +883,19 @@
         </w:tc>
         <w:tc>
           <w:tcPr>
-            <w:tcW w:type="dxa" w:w="4819"/>
-            <w:vAlign w:val="center"/>
-          </w:tcPr>
-          <w:p>
-            <w:pPr>
-              <w:spacing w:after="0" w:line="240" w:lineRule="auto"/>
-              <w:jc w:val="center"/>
-            </w:pPr>
-            <w:r>
-              <w:rPr>
-                <w:rFonts w:ascii="Times New Roman" w:hAnsi="Times New Roman" w:eastAsia="Times New Roman"/>
-                <w:b w:val="0"/>
-                <w:sz w:val="13"/>
+            <w:tcW w:type="dxa" w:w="3052"/>
+            <w:vAlign w:val="center"/>
+          </w:tcPr>
+          <w:p>
+            <w:pPr>
+              <w:spacing w:after="0" w:line="240" w:lineRule="auto"/>
+              <w:jc w:val="center"/>
+            </w:pPr>
+            <w:r>
+              <w:rPr>
+                <w:rFonts w:ascii="Times New Roman" w:hAnsi="Times New Roman" w:eastAsia="Times New Roman"/>
+                <w:b w:val="0"/>
+                <w:sz w:val="11"/>
               </w:rPr>
               <w:t>Transaction cost 15bp, slippage 5bp, market impact 5bp</w:t>
             </w:r>
@@ -902,19 +905,19 @@
       <w:tr>
         <w:tc>
           <w:tcPr>
-            <w:tcW w:type="dxa" w:w="4819"/>
-            <w:vAlign w:val="center"/>
-          </w:tcPr>
-          <w:p>
-            <w:pPr>
-              <w:spacing w:after="0" w:line="240" w:lineRule="auto"/>
-              <w:jc w:val="center"/>
-            </w:pPr>
-            <w:r>
-              <w:rPr>
-                <w:rFonts w:ascii="Times New Roman" w:hAnsi="Times New Roman" w:eastAsia="Times New Roman"/>
-                <w:b w:val="0"/>
-                <w:sz w:val="13"/>
+            <w:tcW w:type="dxa" w:w="1123"/>
+            <w:vAlign w:val="center"/>
+          </w:tcPr>
+          <w:p>
+            <w:pPr>
+              <w:spacing w:after="0" w:line="240" w:lineRule="auto"/>
+              <w:jc w:val="center"/>
+            </w:pPr>
+            <w:r>
+              <w:rPr>
+                <w:rFonts w:ascii="Times New Roman" w:hAnsi="Times New Roman" w:eastAsia="Times New Roman"/>
+                <w:b w:val="0"/>
+                <w:sz w:val="11"/>
               </w:rPr>
               <w:t>Risk controls</w:t>
             </w:r>
@@ -922,19 +925,19 @@
         </w:tc>
         <w:tc>
           <w:tcPr>
-            <w:tcW w:type="dxa" w:w="4819"/>
-            <w:vAlign w:val="center"/>
-          </w:tcPr>
-          <w:p>
-            <w:pPr>
-              <w:spacing w:after="0" w:line="240" w:lineRule="auto"/>
-              <w:jc w:val="center"/>
-            </w:pPr>
-            <w:r>
-              <w:rPr>
-                <w:rFonts w:ascii="Times New Roman" w:hAnsi="Times New Roman" w:eastAsia="Times New Roman"/>
-                <w:b w:val="0"/>
-                <w:sz w:val="13"/>
+            <w:tcW w:type="dxa" w:w="3052"/>
+            <w:vAlign w:val="center"/>
+          </w:tcPr>
+          <w:p>
+            <w:pPr>
+              <w:spacing w:after="0" w:line="240" w:lineRule="auto"/>
+              <w:jc w:val="center"/>
+            </w:pPr>
+            <w:r>
+              <w:rPr>
+                <w:rFonts w:ascii="Times New Roman" w:hAnsi="Times New Roman" w:eastAsia="Times New Roman"/>
+                <w:b w:val="0"/>
+                <w:sz w:val="11"/>
               </w:rPr>
               <w:t>Volatility filter, overheat filter, breadth filter, trailing stop</w:t>
             </w:r>
@@ -977,6 +980,14 @@
     </w:p>
     <w:p>
       <w:pPr>
+        <w:spacing w:before="0" w:after="0"/>
+      </w:pPr>
+      <w:r>
+        <w:br w:type="column"/>
+      </w:r>
+    </w:p>
+    <w:p>
+      <w:pPr>
         <w:spacing w:after="80" w:line="252" w:lineRule="auto"/>
         <w:jc w:val="left"/>
       </w:pPr>
@@ -986,15 +997,15 @@
           <w:b w:val="0"/>
           <w:sz w:val="15"/>
         </w:rPr>
-        <w:t>Table 2. Summary of period-horizon comparison.</w:t>
+        <w:t>Table 2. Period-horizon return comparison (%).</w:t>
       </w:r>
     </w:p>
     <w:tbl>
       <w:tblPr>
         <w:tblStyle w:val="af4"/>
-        <w:tblW w:type="auto" w:w="0"/>
+        <w:tblW w:type="dxa" w:w="3974"/>
         <w:jc w:val="center"/>
-        <w:tblLayout w:type="autofit"/>
+        <w:tblLayout w:type="fixed"/>
         <w:tblLook w:firstColumn="1" w:firstRow="1" w:lastColumn="0" w:lastRow="0" w:noHBand="0" w:noVBand="1" w:val="04A0"/>
       </w:tblPr>
       <w:tblGrid>
@@ -1010,7 +1021,7 @@
         </w:trPr>
         <w:tc>
           <w:tcPr>
-            <w:tcW w:type="dxa" w:w="1928"/>
+            <w:tcW w:type="dxa" w:w="720"/>
             <w:vAlign w:val="center"/>
             <w:shd w:fill="E9EEF4"/>
           </w:tcPr>
@@ -1023,7 +1034,7 @@
               <w:rPr>
                 <w:rFonts w:ascii="Times New Roman" w:hAnsi="Times New Roman" w:eastAsia="Times New Roman"/>
                 <w:b/>
-                <w:sz w:val="13"/>
+                <w:sz w:val="11"/>
               </w:rPr>
               <w:t>Period</w:t>
             </w:r>
@@ -1031,7 +1042,7 @@
         </w:tc>
         <w:tc>
           <w:tcPr>
-            <w:tcW w:type="dxa" w:w="1928"/>
+            <w:tcW w:type="dxa" w:w="604"/>
             <w:vAlign w:val="center"/>
             <w:shd w:fill="E9EEF4"/>
           </w:tcPr>
@@ -1044,15 +1055,15 @@
               <w:rPr>
                 <w:rFonts w:ascii="Times New Roman" w:hAnsi="Times New Roman" w:eastAsia="Times New Roman"/>
                 <w:b/>
-                <w:sz w:val="13"/>
-              </w:rPr>
-              <w:t>Horizon</w:t>
-            </w:r>
-          </w:p>
-        </w:tc>
-        <w:tc>
-          <w:tcPr>
-            <w:tcW w:type="dxa" w:w="1928"/>
+                <w:sz w:val="11"/>
+              </w:rPr>
+              <w:t>H</w:t>
+            </w:r>
+          </w:p>
+        </w:tc>
+        <w:tc>
+          <w:tcPr>
+            <w:tcW w:type="dxa" w:w="892"/>
             <w:vAlign w:val="center"/>
             <w:shd w:fill="E9EEF4"/>
           </w:tcPr>
@@ -1065,7 +1076,7 @@
               <w:rPr>
                 <w:rFonts w:ascii="Times New Roman" w:hAnsi="Times New Roman" w:eastAsia="Times New Roman"/>
                 <w:b/>
-                <w:sz w:val="13"/>
+                <w:sz w:val="11"/>
               </w:rPr>
               <w:t>Hybrid</w:t>
             </w:r>
@@ -1073,7 +1084,7 @@
         </w:tc>
         <w:tc>
           <w:tcPr>
-            <w:tcW w:type="dxa" w:w="1928"/>
+            <w:tcW w:type="dxa" w:w="864"/>
             <w:vAlign w:val="center"/>
             <w:shd w:fill="E9EEF4"/>
           </w:tcPr>
@@ -1086,7 +1097,7 @@
               <w:rPr>
                 <w:rFonts w:ascii="Times New Roman" w:hAnsi="Times New Roman" w:eastAsia="Times New Roman"/>
                 <w:b/>
-                <w:sz w:val="13"/>
+                <w:sz w:val="11"/>
               </w:rPr>
               <w:t>Det.</w:t>
             </w:r>
@@ -1094,7 +1105,7 @@
         </w:tc>
         <w:tc>
           <w:tcPr>
-            <w:tcW w:type="dxa" w:w="1928"/>
+            <w:tcW w:type="dxa" w:w="892"/>
             <w:vAlign w:val="center"/>
             <w:shd w:fill="E9EEF4"/>
           </w:tcPr>
@@ -1107,9 +1118,9 @@
               <w:rPr>
                 <w:rFonts w:ascii="Times New Roman" w:hAnsi="Times New Roman" w:eastAsia="Times New Roman"/>
                 <w:b/>
-                <w:sz w:val="13"/>
-              </w:rPr>
-              <w:t>Best tech</w:t>
+                <w:sz w:val="11"/>
+              </w:rPr>
+              <w:t>Tech</w:t>
             </w:r>
           </w:p>
         </w:tc>
@@ -1117,19 +1128,19 @@
       <w:tr>
         <w:tc>
           <w:tcPr>
-            <w:tcW w:type="dxa" w:w="1928"/>
-            <w:vAlign w:val="center"/>
-          </w:tcPr>
-          <w:p>
-            <w:pPr>
-              <w:spacing w:after="0" w:line="240" w:lineRule="auto"/>
-              <w:jc w:val="center"/>
-            </w:pPr>
-            <w:r>
-              <w:rPr>
-                <w:rFonts w:ascii="Times New Roman" w:hAnsi="Times New Roman" w:eastAsia="Times New Roman"/>
-                <w:b w:val="0"/>
-                <w:sz w:val="13"/>
+            <w:tcW w:type="dxa" w:w="720"/>
+            <w:vAlign w:val="center"/>
+          </w:tcPr>
+          <w:p>
+            <w:pPr>
+              <w:spacing w:after="0" w:line="240" w:lineRule="auto"/>
+              <w:jc w:val="center"/>
+            </w:pPr>
+            <w:r>
+              <w:rPr>
+                <w:rFonts w:ascii="Times New Roman" w:hAnsi="Times New Roman" w:eastAsia="Times New Roman"/>
+                <w:b w:val="0"/>
+                <w:sz w:val="10"/>
               </w:rPr>
               <w:t>2023</w:t>
             </w:r>
@@ -1137,81 +1148,81 @@
         </w:tc>
         <w:tc>
           <w:tcPr>
-            <w:tcW w:type="dxa" w:w="1928"/>
-            <w:vAlign w:val="center"/>
-          </w:tcPr>
-          <w:p>
-            <w:pPr>
-              <w:spacing w:after="0" w:line="240" w:lineRule="auto"/>
-              <w:jc w:val="center"/>
-            </w:pPr>
-            <w:r>
-              <w:rPr>
-                <w:rFonts w:ascii="Times New Roman" w:hAnsi="Times New Roman" w:eastAsia="Times New Roman"/>
-                <w:b w:val="0"/>
-                <w:sz w:val="13"/>
-              </w:rPr>
-              <w:t>Short</w:t>
-            </w:r>
-          </w:p>
-        </w:tc>
-        <w:tc>
-          <w:tcPr>
-            <w:tcW w:type="dxa" w:w="1928"/>
-            <w:vAlign w:val="center"/>
-          </w:tcPr>
-          <w:p>
-            <w:pPr>
-              <w:spacing w:after="0" w:line="240" w:lineRule="auto"/>
-              <w:jc w:val="center"/>
-            </w:pPr>
-            <w:r>
-              <w:rPr>
-                <w:rFonts w:ascii="Times New Roman" w:hAnsi="Times New Roman" w:eastAsia="Times New Roman"/>
-                <w:b w:val="0"/>
-                <w:sz w:val="13"/>
-              </w:rPr>
-              <w:t>14.92%</w:t>
-            </w:r>
-          </w:p>
-        </w:tc>
-        <w:tc>
-          <w:tcPr>
-            <w:tcW w:type="dxa" w:w="1928"/>
-            <w:vAlign w:val="center"/>
-          </w:tcPr>
-          <w:p>
-            <w:pPr>
-              <w:spacing w:after="0" w:line="240" w:lineRule="auto"/>
-              <w:jc w:val="center"/>
-            </w:pPr>
-            <w:r>
-              <w:rPr>
-                <w:rFonts w:ascii="Times New Roman" w:hAnsi="Times New Roman" w:eastAsia="Times New Roman"/>
-                <w:b w:val="0"/>
-                <w:sz w:val="13"/>
-              </w:rPr>
-              <w:t>13.58%</w:t>
-            </w:r>
-          </w:p>
-        </w:tc>
-        <w:tc>
-          <w:tcPr>
-            <w:tcW w:type="dxa" w:w="1928"/>
-            <w:vAlign w:val="center"/>
-          </w:tcPr>
-          <w:p>
-            <w:pPr>
-              <w:spacing w:after="0" w:line="240" w:lineRule="auto"/>
-              <w:jc w:val="center"/>
-            </w:pPr>
-            <w:r>
-              <w:rPr>
-                <w:rFonts w:ascii="Times New Roman" w:hAnsi="Times New Roman" w:eastAsia="Times New Roman"/>
-                <w:b w:val="0"/>
-                <w:sz w:val="13"/>
-              </w:rPr>
-              <w:t>15.15%</w:t>
+            <w:tcW w:type="dxa" w:w="604"/>
+            <w:vAlign w:val="center"/>
+          </w:tcPr>
+          <w:p>
+            <w:pPr>
+              <w:spacing w:after="0" w:line="240" w:lineRule="auto"/>
+              <w:jc w:val="center"/>
+            </w:pPr>
+            <w:r>
+              <w:rPr>
+                <w:rFonts w:ascii="Times New Roman" w:hAnsi="Times New Roman" w:eastAsia="Times New Roman"/>
+                <w:b w:val="0"/>
+                <w:sz w:val="10"/>
+              </w:rPr>
+              <w:t>S</w:t>
+            </w:r>
+          </w:p>
+        </w:tc>
+        <w:tc>
+          <w:tcPr>
+            <w:tcW w:type="dxa" w:w="892"/>
+            <w:vAlign w:val="center"/>
+          </w:tcPr>
+          <w:p>
+            <w:pPr>
+              <w:spacing w:after="0" w:line="240" w:lineRule="auto"/>
+              <w:jc w:val="center"/>
+            </w:pPr>
+            <w:r>
+              <w:rPr>
+                <w:rFonts w:ascii="Times New Roman" w:hAnsi="Times New Roman" w:eastAsia="Times New Roman"/>
+                <w:b w:val="0"/>
+                <w:sz w:val="10"/>
+              </w:rPr>
+              <w:t>14.92</w:t>
+            </w:r>
+          </w:p>
+        </w:tc>
+        <w:tc>
+          <w:tcPr>
+            <w:tcW w:type="dxa" w:w="864"/>
+            <w:vAlign w:val="center"/>
+          </w:tcPr>
+          <w:p>
+            <w:pPr>
+              <w:spacing w:after="0" w:line="240" w:lineRule="auto"/>
+              <w:jc w:val="center"/>
+            </w:pPr>
+            <w:r>
+              <w:rPr>
+                <w:rFonts w:ascii="Times New Roman" w:hAnsi="Times New Roman" w:eastAsia="Times New Roman"/>
+                <w:b w:val="0"/>
+                <w:sz w:val="10"/>
+              </w:rPr>
+              <w:t>13.58</w:t>
+            </w:r>
+          </w:p>
+        </w:tc>
+        <w:tc>
+          <w:tcPr>
+            <w:tcW w:type="dxa" w:w="892"/>
+            <w:vAlign w:val="center"/>
+          </w:tcPr>
+          <w:p>
+            <w:pPr>
+              <w:spacing w:after="0" w:line="240" w:lineRule="auto"/>
+              <w:jc w:val="center"/>
+            </w:pPr>
+            <w:r>
+              <w:rPr>
+                <w:rFonts w:ascii="Times New Roman" w:hAnsi="Times New Roman" w:eastAsia="Times New Roman"/>
+                <w:b w:val="0"/>
+                <w:sz w:val="10"/>
+              </w:rPr>
+              <w:t>15.15</w:t>
             </w:r>
           </w:p>
         </w:tc>
@@ -1219,19 +1230,19 @@
       <w:tr>
         <w:tc>
           <w:tcPr>
-            <w:tcW w:type="dxa" w:w="1928"/>
-            <w:vAlign w:val="center"/>
-          </w:tcPr>
-          <w:p>
-            <w:pPr>
-              <w:spacing w:after="0" w:line="240" w:lineRule="auto"/>
-              <w:jc w:val="center"/>
-            </w:pPr>
-            <w:r>
-              <w:rPr>
-                <w:rFonts w:ascii="Times New Roman" w:hAnsi="Times New Roman" w:eastAsia="Times New Roman"/>
-                <w:b w:val="0"/>
-                <w:sz w:val="13"/>
+            <w:tcW w:type="dxa" w:w="720"/>
+            <w:vAlign w:val="center"/>
+          </w:tcPr>
+          <w:p>
+            <w:pPr>
+              <w:spacing w:after="0" w:line="240" w:lineRule="auto"/>
+              <w:jc w:val="center"/>
+            </w:pPr>
+            <w:r>
+              <w:rPr>
+                <w:rFonts w:ascii="Times New Roman" w:hAnsi="Times New Roman" w:eastAsia="Times New Roman"/>
+                <w:b w:val="0"/>
+                <w:sz w:val="10"/>
               </w:rPr>
               <w:t>2023</w:t>
             </w:r>
@@ -1239,81 +1250,81 @@
         </w:tc>
         <w:tc>
           <w:tcPr>
-            <w:tcW w:type="dxa" w:w="1928"/>
-            <w:vAlign w:val="center"/>
-          </w:tcPr>
-          <w:p>
-            <w:pPr>
-              <w:spacing w:after="0" w:line="240" w:lineRule="auto"/>
-              <w:jc w:val="center"/>
-            </w:pPr>
-            <w:r>
-              <w:rPr>
-                <w:rFonts w:ascii="Times New Roman" w:hAnsi="Times New Roman" w:eastAsia="Times New Roman"/>
-                <w:b w:val="0"/>
-                <w:sz w:val="13"/>
-              </w:rPr>
-              <w:t>Long</w:t>
-            </w:r>
-          </w:p>
-        </w:tc>
-        <w:tc>
-          <w:tcPr>
-            <w:tcW w:type="dxa" w:w="1928"/>
-            <w:vAlign w:val="center"/>
-          </w:tcPr>
-          <w:p>
-            <w:pPr>
-              <w:spacing w:after="0" w:line="240" w:lineRule="auto"/>
-              <w:jc w:val="center"/>
-            </w:pPr>
-            <w:r>
-              <w:rPr>
-                <w:rFonts w:ascii="Times New Roman" w:hAnsi="Times New Roman" w:eastAsia="Times New Roman"/>
-                <w:b w:val="0"/>
-                <w:sz w:val="13"/>
-              </w:rPr>
-              <w:t>-0.42%</w:t>
-            </w:r>
-          </w:p>
-        </w:tc>
-        <w:tc>
-          <w:tcPr>
-            <w:tcW w:type="dxa" w:w="1928"/>
-            <w:vAlign w:val="center"/>
-          </w:tcPr>
-          <w:p>
-            <w:pPr>
-              <w:spacing w:after="0" w:line="240" w:lineRule="auto"/>
-              <w:jc w:val="center"/>
-            </w:pPr>
-            <w:r>
-              <w:rPr>
-                <w:rFonts w:ascii="Times New Roman" w:hAnsi="Times New Roman" w:eastAsia="Times New Roman"/>
-                <w:b w:val="0"/>
-                <w:sz w:val="13"/>
-              </w:rPr>
-              <w:t>7.64%</w:t>
-            </w:r>
-          </w:p>
-        </w:tc>
-        <w:tc>
-          <w:tcPr>
-            <w:tcW w:type="dxa" w:w="1928"/>
-            <w:vAlign w:val="center"/>
-          </w:tcPr>
-          <w:p>
-            <w:pPr>
-              <w:spacing w:after="0" w:line="240" w:lineRule="auto"/>
-              <w:jc w:val="center"/>
-            </w:pPr>
-            <w:r>
-              <w:rPr>
-                <w:rFonts w:ascii="Times New Roman" w:hAnsi="Times New Roman" w:eastAsia="Times New Roman"/>
-                <w:b w:val="0"/>
-                <w:sz w:val="13"/>
-              </w:rPr>
-              <w:t>52.69%</w:t>
+            <w:tcW w:type="dxa" w:w="604"/>
+            <w:vAlign w:val="center"/>
+          </w:tcPr>
+          <w:p>
+            <w:pPr>
+              <w:spacing w:after="0" w:line="240" w:lineRule="auto"/>
+              <w:jc w:val="center"/>
+            </w:pPr>
+            <w:r>
+              <w:rPr>
+                <w:rFonts w:ascii="Times New Roman" w:hAnsi="Times New Roman" w:eastAsia="Times New Roman"/>
+                <w:b w:val="0"/>
+                <w:sz w:val="10"/>
+              </w:rPr>
+              <w:t>L</w:t>
+            </w:r>
+          </w:p>
+        </w:tc>
+        <w:tc>
+          <w:tcPr>
+            <w:tcW w:type="dxa" w:w="892"/>
+            <w:vAlign w:val="center"/>
+          </w:tcPr>
+          <w:p>
+            <w:pPr>
+              <w:spacing w:after="0" w:line="240" w:lineRule="auto"/>
+              <w:jc w:val="center"/>
+            </w:pPr>
+            <w:r>
+              <w:rPr>
+                <w:rFonts w:ascii="Times New Roman" w:hAnsi="Times New Roman" w:eastAsia="Times New Roman"/>
+                <w:b w:val="0"/>
+                <w:sz w:val="10"/>
+              </w:rPr>
+              <w:t>-0.42</w:t>
+            </w:r>
+          </w:p>
+        </w:tc>
+        <w:tc>
+          <w:tcPr>
+            <w:tcW w:type="dxa" w:w="864"/>
+            <w:vAlign w:val="center"/>
+          </w:tcPr>
+          <w:p>
+            <w:pPr>
+              <w:spacing w:after="0" w:line="240" w:lineRule="auto"/>
+              <w:jc w:val="center"/>
+            </w:pPr>
+            <w:r>
+              <w:rPr>
+                <w:rFonts w:ascii="Times New Roman" w:hAnsi="Times New Roman" w:eastAsia="Times New Roman"/>
+                <w:b w:val="0"/>
+                <w:sz w:val="10"/>
+              </w:rPr>
+              <w:t>7.64</w:t>
+            </w:r>
+          </w:p>
+        </w:tc>
+        <w:tc>
+          <w:tcPr>
+            <w:tcW w:type="dxa" w:w="892"/>
+            <w:vAlign w:val="center"/>
+          </w:tcPr>
+          <w:p>
+            <w:pPr>
+              <w:spacing w:after="0" w:line="240" w:lineRule="auto"/>
+              <w:jc w:val="center"/>
+            </w:pPr>
+            <w:r>
+              <w:rPr>
+                <w:rFonts w:ascii="Times New Roman" w:hAnsi="Times New Roman" w:eastAsia="Times New Roman"/>
+                <w:b w:val="0"/>
+                <w:sz w:val="10"/>
+              </w:rPr>
+              <w:t>52.69</w:t>
             </w:r>
           </w:p>
         </w:tc>
@@ -1321,19 +1332,19 @@
       <w:tr>
         <w:tc>
           <w:tcPr>
-            <w:tcW w:type="dxa" w:w="1928"/>
-            <w:vAlign w:val="center"/>
-          </w:tcPr>
-          <w:p>
-            <w:pPr>
-              <w:spacing w:after="0" w:line="240" w:lineRule="auto"/>
-              <w:jc w:val="center"/>
-            </w:pPr>
-            <w:r>
-              <w:rPr>
-                <w:rFonts w:ascii="Times New Roman" w:hAnsi="Times New Roman" w:eastAsia="Times New Roman"/>
-                <w:b w:val="0"/>
-                <w:sz w:val="13"/>
+            <w:tcW w:type="dxa" w:w="720"/>
+            <w:vAlign w:val="center"/>
+          </w:tcPr>
+          <w:p>
+            <w:pPr>
+              <w:spacing w:after="0" w:line="240" w:lineRule="auto"/>
+              <w:jc w:val="center"/>
+            </w:pPr>
+            <w:r>
+              <w:rPr>
+                <w:rFonts w:ascii="Times New Roman" w:hAnsi="Times New Roman" w:eastAsia="Times New Roman"/>
+                <w:b w:val="0"/>
+                <w:sz w:val="10"/>
               </w:rPr>
               <w:t>2024</w:t>
             </w:r>
@@ -1341,81 +1352,81 @@
         </w:tc>
         <w:tc>
           <w:tcPr>
-            <w:tcW w:type="dxa" w:w="1928"/>
-            <w:vAlign w:val="center"/>
-          </w:tcPr>
-          <w:p>
-            <w:pPr>
-              <w:spacing w:after="0" w:line="240" w:lineRule="auto"/>
-              <w:jc w:val="center"/>
-            </w:pPr>
-            <w:r>
-              <w:rPr>
-                <w:rFonts w:ascii="Times New Roman" w:hAnsi="Times New Roman" w:eastAsia="Times New Roman"/>
-                <w:b w:val="0"/>
-                <w:sz w:val="13"/>
-              </w:rPr>
-              <w:t>Short</w:t>
-            </w:r>
-          </w:p>
-        </w:tc>
-        <w:tc>
-          <w:tcPr>
-            <w:tcW w:type="dxa" w:w="1928"/>
-            <w:vAlign w:val="center"/>
-          </w:tcPr>
-          <w:p>
-            <w:pPr>
-              <w:spacing w:after="0" w:line="240" w:lineRule="auto"/>
-              <w:jc w:val="center"/>
-            </w:pPr>
-            <w:r>
-              <w:rPr>
-                <w:rFonts w:ascii="Times New Roman" w:hAnsi="Times New Roman" w:eastAsia="Times New Roman"/>
-                <w:b w:val="0"/>
-                <w:sz w:val="13"/>
-              </w:rPr>
-              <w:t>46.99%</w:t>
-            </w:r>
-          </w:p>
-        </w:tc>
-        <w:tc>
-          <w:tcPr>
-            <w:tcW w:type="dxa" w:w="1928"/>
-            <w:vAlign w:val="center"/>
-          </w:tcPr>
-          <w:p>
-            <w:pPr>
-              <w:spacing w:after="0" w:line="240" w:lineRule="auto"/>
-              <w:jc w:val="center"/>
-            </w:pPr>
-            <w:r>
-              <w:rPr>
-                <w:rFonts w:ascii="Times New Roman" w:hAnsi="Times New Roman" w:eastAsia="Times New Roman"/>
-                <w:b w:val="0"/>
-                <w:sz w:val="13"/>
-              </w:rPr>
-              <w:t>38.27%</w:t>
-            </w:r>
-          </w:p>
-        </w:tc>
-        <w:tc>
-          <w:tcPr>
-            <w:tcW w:type="dxa" w:w="1928"/>
-            <w:vAlign w:val="center"/>
-          </w:tcPr>
-          <w:p>
-            <w:pPr>
-              <w:spacing w:after="0" w:line="240" w:lineRule="auto"/>
-              <w:jc w:val="center"/>
-            </w:pPr>
-            <w:r>
-              <w:rPr>
-                <w:rFonts w:ascii="Times New Roman" w:hAnsi="Times New Roman" w:eastAsia="Times New Roman"/>
-                <w:b w:val="0"/>
-                <w:sz w:val="13"/>
-              </w:rPr>
-              <w:t>167.72%</w:t>
+            <w:tcW w:type="dxa" w:w="604"/>
+            <w:vAlign w:val="center"/>
+          </w:tcPr>
+          <w:p>
+            <w:pPr>
+              <w:spacing w:after="0" w:line="240" w:lineRule="auto"/>
+              <w:jc w:val="center"/>
+            </w:pPr>
+            <w:r>
+              <w:rPr>
+                <w:rFonts w:ascii="Times New Roman" w:hAnsi="Times New Roman" w:eastAsia="Times New Roman"/>
+                <w:b w:val="0"/>
+                <w:sz w:val="10"/>
+              </w:rPr>
+              <w:t>S</w:t>
+            </w:r>
+          </w:p>
+        </w:tc>
+        <w:tc>
+          <w:tcPr>
+            <w:tcW w:type="dxa" w:w="892"/>
+            <w:vAlign w:val="center"/>
+          </w:tcPr>
+          <w:p>
+            <w:pPr>
+              <w:spacing w:after="0" w:line="240" w:lineRule="auto"/>
+              <w:jc w:val="center"/>
+            </w:pPr>
+            <w:r>
+              <w:rPr>
+                <w:rFonts w:ascii="Times New Roman" w:hAnsi="Times New Roman" w:eastAsia="Times New Roman"/>
+                <w:b w:val="0"/>
+                <w:sz w:val="10"/>
+              </w:rPr>
+              <w:t>46.99</w:t>
+            </w:r>
+          </w:p>
+        </w:tc>
+        <w:tc>
+          <w:tcPr>
+            <w:tcW w:type="dxa" w:w="864"/>
+            <w:vAlign w:val="center"/>
+          </w:tcPr>
+          <w:p>
+            <w:pPr>
+              <w:spacing w:after="0" w:line="240" w:lineRule="auto"/>
+              <w:jc w:val="center"/>
+            </w:pPr>
+            <w:r>
+              <w:rPr>
+                <w:rFonts w:ascii="Times New Roman" w:hAnsi="Times New Roman" w:eastAsia="Times New Roman"/>
+                <w:b w:val="0"/>
+                <w:sz w:val="10"/>
+              </w:rPr>
+              <w:t>38.27</w:t>
+            </w:r>
+          </w:p>
+        </w:tc>
+        <w:tc>
+          <w:tcPr>
+            <w:tcW w:type="dxa" w:w="892"/>
+            <w:vAlign w:val="center"/>
+          </w:tcPr>
+          <w:p>
+            <w:pPr>
+              <w:spacing w:after="0" w:line="240" w:lineRule="auto"/>
+              <w:jc w:val="center"/>
+            </w:pPr>
+            <w:r>
+              <w:rPr>
+                <w:rFonts w:ascii="Times New Roman" w:hAnsi="Times New Roman" w:eastAsia="Times New Roman"/>
+                <w:b w:val="0"/>
+                <w:sz w:val="10"/>
+              </w:rPr>
+              <w:t>167.72</w:t>
             </w:r>
           </w:p>
         </w:tc>
@@ -1423,19 +1434,19 @@
       <w:tr>
         <w:tc>
           <w:tcPr>
-            <w:tcW w:type="dxa" w:w="1928"/>
-            <w:vAlign w:val="center"/>
-          </w:tcPr>
-          <w:p>
-            <w:pPr>
-              <w:spacing w:after="0" w:line="240" w:lineRule="auto"/>
-              <w:jc w:val="center"/>
-            </w:pPr>
-            <w:r>
-              <w:rPr>
-                <w:rFonts w:ascii="Times New Roman" w:hAnsi="Times New Roman" w:eastAsia="Times New Roman"/>
-                <w:b w:val="0"/>
-                <w:sz w:val="13"/>
+            <w:tcW w:type="dxa" w:w="720"/>
+            <w:vAlign w:val="center"/>
+          </w:tcPr>
+          <w:p>
+            <w:pPr>
+              <w:spacing w:after="0" w:line="240" w:lineRule="auto"/>
+              <w:jc w:val="center"/>
+            </w:pPr>
+            <w:r>
+              <w:rPr>
+                <w:rFonts w:ascii="Times New Roman" w:hAnsi="Times New Roman" w:eastAsia="Times New Roman"/>
+                <w:b w:val="0"/>
+                <w:sz w:val="10"/>
               </w:rPr>
               <w:t>2024</w:t>
             </w:r>
@@ -1443,81 +1454,81 @@
         </w:tc>
         <w:tc>
           <w:tcPr>
-            <w:tcW w:type="dxa" w:w="1928"/>
-            <w:vAlign w:val="center"/>
-          </w:tcPr>
-          <w:p>
-            <w:pPr>
-              <w:spacing w:after="0" w:line="240" w:lineRule="auto"/>
-              <w:jc w:val="center"/>
-            </w:pPr>
-            <w:r>
-              <w:rPr>
-                <w:rFonts w:ascii="Times New Roman" w:hAnsi="Times New Roman" w:eastAsia="Times New Roman"/>
-                <w:b w:val="0"/>
-                <w:sz w:val="13"/>
-              </w:rPr>
-              <w:t>Long</w:t>
-            </w:r>
-          </w:p>
-        </w:tc>
-        <w:tc>
-          <w:tcPr>
-            <w:tcW w:type="dxa" w:w="1928"/>
-            <w:vAlign w:val="center"/>
-          </w:tcPr>
-          <w:p>
-            <w:pPr>
-              <w:spacing w:after="0" w:line="240" w:lineRule="auto"/>
-              <w:jc w:val="center"/>
-            </w:pPr>
-            <w:r>
-              <w:rPr>
-                <w:rFonts w:ascii="Times New Roman" w:hAnsi="Times New Roman" w:eastAsia="Times New Roman"/>
-                <w:b w:val="0"/>
-                <w:sz w:val="13"/>
-              </w:rPr>
-              <w:t>0.08%</w:t>
-            </w:r>
-          </w:p>
-        </w:tc>
-        <w:tc>
-          <w:tcPr>
-            <w:tcW w:type="dxa" w:w="1928"/>
-            <w:vAlign w:val="center"/>
-          </w:tcPr>
-          <w:p>
-            <w:pPr>
-              <w:spacing w:after="0" w:line="240" w:lineRule="auto"/>
-              <w:jc w:val="center"/>
-            </w:pPr>
-            <w:r>
-              <w:rPr>
-                <w:rFonts w:ascii="Times New Roman" w:hAnsi="Times New Roman" w:eastAsia="Times New Roman"/>
-                <w:b w:val="0"/>
-                <w:sz w:val="13"/>
-              </w:rPr>
-              <w:t>16.78%</w:t>
-            </w:r>
-          </w:p>
-        </w:tc>
-        <w:tc>
-          <w:tcPr>
-            <w:tcW w:type="dxa" w:w="1928"/>
-            <w:vAlign w:val="center"/>
-          </w:tcPr>
-          <w:p>
-            <w:pPr>
-              <w:spacing w:after="0" w:line="240" w:lineRule="auto"/>
-              <w:jc w:val="center"/>
-            </w:pPr>
-            <w:r>
-              <w:rPr>
-                <w:rFonts w:ascii="Times New Roman" w:hAnsi="Times New Roman" w:eastAsia="Times New Roman"/>
-                <w:b w:val="0"/>
-                <w:sz w:val="13"/>
-              </w:rPr>
-              <w:t>16.02%</w:t>
+            <w:tcW w:type="dxa" w:w="604"/>
+            <w:vAlign w:val="center"/>
+          </w:tcPr>
+          <w:p>
+            <w:pPr>
+              <w:spacing w:after="0" w:line="240" w:lineRule="auto"/>
+              <w:jc w:val="center"/>
+            </w:pPr>
+            <w:r>
+              <w:rPr>
+                <w:rFonts w:ascii="Times New Roman" w:hAnsi="Times New Roman" w:eastAsia="Times New Roman"/>
+                <w:b w:val="0"/>
+                <w:sz w:val="10"/>
+              </w:rPr>
+              <w:t>L</w:t>
+            </w:r>
+          </w:p>
+        </w:tc>
+        <w:tc>
+          <w:tcPr>
+            <w:tcW w:type="dxa" w:w="892"/>
+            <w:vAlign w:val="center"/>
+          </w:tcPr>
+          <w:p>
+            <w:pPr>
+              <w:spacing w:after="0" w:line="240" w:lineRule="auto"/>
+              <w:jc w:val="center"/>
+            </w:pPr>
+            <w:r>
+              <w:rPr>
+                <w:rFonts w:ascii="Times New Roman" w:hAnsi="Times New Roman" w:eastAsia="Times New Roman"/>
+                <w:b w:val="0"/>
+                <w:sz w:val="10"/>
+              </w:rPr>
+              <w:t>0.08</w:t>
+            </w:r>
+          </w:p>
+        </w:tc>
+        <w:tc>
+          <w:tcPr>
+            <w:tcW w:type="dxa" w:w="864"/>
+            <w:vAlign w:val="center"/>
+          </w:tcPr>
+          <w:p>
+            <w:pPr>
+              <w:spacing w:after="0" w:line="240" w:lineRule="auto"/>
+              <w:jc w:val="center"/>
+            </w:pPr>
+            <w:r>
+              <w:rPr>
+                <w:rFonts w:ascii="Times New Roman" w:hAnsi="Times New Roman" w:eastAsia="Times New Roman"/>
+                <w:b w:val="0"/>
+                <w:sz w:val="10"/>
+              </w:rPr>
+              <w:t>16.78</w:t>
+            </w:r>
+          </w:p>
+        </w:tc>
+        <w:tc>
+          <w:tcPr>
+            <w:tcW w:type="dxa" w:w="892"/>
+            <w:vAlign w:val="center"/>
+          </w:tcPr>
+          <w:p>
+            <w:pPr>
+              <w:spacing w:after="0" w:line="240" w:lineRule="auto"/>
+              <w:jc w:val="center"/>
+            </w:pPr>
+            <w:r>
+              <w:rPr>
+                <w:rFonts w:ascii="Times New Roman" w:hAnsi="Times New Roman" w:eastAsia="Times New Roman"/>
+                <w:b w:val="0"/>
+                <w:sz w:val="10"/>
+              </w:rPr>
+              <w:t>16.02</w:t>
             </w:r>
           </w:p>
         </w:tc>
@@ -1525,19 +1536,19 @@
       <w:tr>
         <w:tc>
           <w:tcPr>
-            <w:tcW w:type="dxa" w:w="1928"/>
-            <w:vAlign w:val="center"/>
-          </w:tcPr>
-          <w:p>
-            <w:pPr>
-              <w:spacing w:after="0" w:line="240" w:lineRule="auto"/>
-              <w:jc w:val="center"/>
-            </w:pPr>
-            <w:r>
-              <w:rPr>
-                <w:rFonts w:ascii="Times New Roman" w:hAnsi="Times New Roman" w:eastAsia="Times New Roman"/>
-                <w:b w:val="0"/>
-                <w:sz w:val="13"/>
+            <w:tcW w:type="dxa" w:w="720"/>
+            <w:vAlign w:val="center"/>
+          </w:tcPr>
+          <w:p>
+            <w:pPr>
+              <w:spacing w:after="0" w:line="240" w:lineRule="auto"/>
+              <w:jc w:val="center"/>
+            </w:pPr>
+            <w:r>
+              <w:rPr>
+                <w:rFonts w:ascii="Times New Roman" w:hAnsi="Times New Roman" w:eastAsia="Times New Roman"/>
+                <w:b w:val="0"/>
+                <w:sz w:val="10"/>
               </w:rPr>
               <w:t>2025</w:t>
             </w:r>
@@ -1545,81 +1556,81 @@
         </w:tc>
         <w:tc>
           <w:tcPr>
-            <w:tcW w:type="dxa" w:w="1928"/>
-            <w:vAlign w:val="center"/>
-          </w:tcPr>
-          <w:p>
-            <w:pPr>
-              <w:spacing w:after="0" w:line="240" w:lineRule="auto"/>
-              <w:jc w:val="center"/>
-            </w:pPr>
-            <w:r>
-              <w:rPr>
-                <w:rFonts w:ascii="Times New Roman" w:hAnsi="Times New Roman" w:eastAsia="Times New Roman"/>
-                <w:b w:val="0"/>
-                <w:sz w:val="13"/>
-              </w:rPr>
-              <w:t>Short</w:t>
-            </w:r>
-          </w:p>
-        </w:tc>
-        <w:tc>
-          <w:tcPr>
-            <w:tcW w:type="dxa" w:w="1928"/>
-            <w:vAlign w:val="center"/>
-          </w:tcPr>
-          <w:p>
-            <w:pPr>
-              <w:spacing w:after="0" w:line="240" w:lineRule="auto"/>
-              <w:jc w:val="center"/>
-            </w:pPr>
-            <w:r>
-              <w:rPr>
-                <w:rFonts w:ascii="Times New Roman" w:hAnsi="Times New Roman" w:eastAsia="Times New Roman"/>
-                <w:b w:val="0"/>
-                <w:sz w:val="13"/>
-              </w:rPr>
-              <w:t>190.16%</w:t>
-            </w:r>
-          </w:p>
-        </w:tc>
-        <w:tc>
-          <w:tcPr>
-            <w:tcW w:type="dxa" w:w="1928"/>
-            <w:vAlign w:val="center"/>
-          </w:tcPr>
-          <w:p>
-            <w:pPr>
-              <w:spacing w:after="0" w:line="240" w:lineRule="auto"/>
-              <w:jc w:val="center"/>
-            </w:pPr>
-            <w:r>
-              <w:rPr>
-                <w:rFonts w:ascii="Times New Roman" w:hAnsi="Times New Roman" w:eastAsia="Times New Roman"/>
-                <w:b w:val="0"/>
-                <w:sz w:val="13"/>
-              </w:rPr>
-              <w:t>216.92%</w:t>
-            </w:r>
-          </w:p>
-        </w:tc>
-        <w:tc>
-          <w:tcPr>
-            <w:tcW w:type="dxa" w:w="1928"/>
-            <w:vAlign w:val="center"/>
-          </w:tcPr>
-          <w:p>
-            <w:pPr>
-              <w:spacing w:after="0" w:line="240" w:lineRule="auto"/>
-              <w:jc w:val="center"/>
-            </w:pPr>
-            <w:r>
-              <w:rPr>
-                <w:rFonts w:ascii="Times New Roman" w:hAnsi="Times New Roman" w:eastAsia="Times New Roman"/>
-                <w:b w:val="0"/>
-                <w:sz w:val="13"/>
-              </w:rPr>
-              <w:t>60.08%</w:t>
+            <w:tcW w:type="dxa" w:w="604"/>
+            <w:vAlign w:val="center"/>
+          </w:tcPr>
+          <w:p>
+            <w:pPr>
+              <w:spacing w:after="0" w:line="240" w:lineRule="auto"/>
+              <w:jc w:val="center"/>
+            </w:pPr>
+            <w:r>
+              <w:rPr>
+                <w:rFonts w:ascii="Times New Roman" w:hAnsi="Times New Roman" w:eastAsia="Times New Roman"/>
+                <w:b w:val="0"/>
+                <w:sz w:val="10"/>
+              </w:rPr>
+              <w:t>S</w:t>
+            </w:r>
+          </w:p>
+        </w:tc>
+        <w:tc>
+          <w:tcPr>
+            <w:tcW w:type="dxa" w:w="892"/>
+            <w:vAlign w:val="center"/>
+          </w:tcPr>
+          <w:p>
+            <w:pPr>
+              <w:spacing w:after="0" w:line="240" w:lineRule="auto"/>
+              <w:jc w:val="center"/>
+            </w:pPr>
+            <w:r>
+              <w:rPr>
+                <w:rFonts w:ascii="Times New Roman" w:hAnsi="Times New Roman" w:eastAsia="Times New Roman"/>
+                <w:b w:val="0"/>
+                <w:sz w:val="10"/>
+              </w:rPr>
+              <w:t>190.16</w:t>
+            </w:r>
+          </w:p>
+        </w:tc>
+        <w:tc>
+          <w:tcPr>
+            <w:tcW w:type="dxa" w:w="864"/>
+            <w:vAlign w:val="center"/>
+          </w:tcPr>
+          <w:p>
+            <w:pPr>
+              <w:spacing w:after="0" w:line="240" w:lineRule="auto"/>
+              <w:jc w:val="center"/>
+            </w:pPr>
+            <w:r>
+              <w:rPr>
+                <w:rFonts w:ascii="Times New Roman" w:hAnsi="Times New Roman" w:eastAsia="Times New Roman"/>
+                <w:b w:val="0"/>
+                <w:sz w:val="10"/>
+              </w:rPr>
+              <w:t>216.92</w:t>
+            </w:r>
+          </w:p>
+        </w:tc>
+        <w:tc>
+          <w:tcPr>
+            <w:tcW w:type="dxa" w:w="892"/>
+            <w:vAlign w:val="center"/>
+          </w:tcPr>
+          <w:p>
+            <w:pPr>
+              <w:spacing w:after="0" w:line="240" w:lineRule="auto"/>
+              <w:jc w:val="center"/>
+            </w:pPr>
+            <w:r>
+              <w:rPr>
+                <w:rFonts w:ascii="Times New Roman" w:hAnsi="Times New Roman" w:eastAsia="Times New Roman"/>
+                <w:b w:val="0"/>
+                <w:sz w:val="10"/>
+              </w:rPr>
+              <w:t>60.08</w:t>
             </w:r>
           </w:p>
         </w:tc>
@@ -1627,19 +1638,19 @@
       <w:tr>
         <w:tc>
           <w:tcPr>
-            <w:tcW w:type="dxa" w:w="1928"/>
-            <w:vAlign w:val="center"/>
-          </w:tcPr>
-          <w:p>
-            <w:pPr>
-              <w:spacing w:after="0" w:line="240" w:lineRule="auto"/>
-              <w:jc w:val="center"/>
-            </w:pPr>
-            <w:r>
-              <w:rPr>
-                <w:rFonts w:ascii="Times New Roman" w:hAnsi="Times New Roman" w:eastAsia="Times New Roman"/>
-                <w:b w:val="0"/>
-                <w:sz w:val="13"/>
+            <w:tcW w:type="dxa" w:w="720"/>
+            <w:vAlign w:val="center"/>
+          </w:tcPr>
+          <w:p>
+            <w:pPr>
+              <w:spacing w:after="0" w:line="240" w:lineRule="auto"/>
+              <w:jc w:val="center"/>
+            </w:pPr>
+            <w:r>
+              <w:rPr>
+                <w:rFonts w:ascii="Times New Roman" w:hAnsi="Times New Roman" w:eastAsia="Times New Roman"/>
+                <w:b w:val="0"/>
+                <w:sz w:val="10"/>
               </w:rPr>
               <w:t>2025</w:t>
             </w:r>
@@ -1647,81 +1658,81 @@
         </w:tc>
         <w:tc>
           <w:tcPr>
-            <w:tcW w:type="dxa" w:w="1928"/>
-            <w:vAlign w:val="center"/>
-          </w:tcPr>
-          <w:p>
-            <w:pPr>
-              <w:spacing w:after="0" w:line="240" w:lineRule="auto"/>
-              <w:jc w:val="center"/>
-            </w:pPr>
-            <w:r>
-              <w:rPr>
-                <w:rFonts w:ascii="Times New Roman" w:hAnsi="Times New Roman" w:eastAsia="Times New Roman"/>
-                <w:b w:val="0"/>
-                <w:sz w:val="13"/>
-              </w:rPr>
-              <w:t>Long</w:t>
-            </w:r>
-          </w:p>
-        </w:tc>
-        <w:tc>
-          <w:tcPr>
-            <w:tcW w:type="dxa" w:w="1928"/>
-            <w:vAlign w:val="center"/>
-          </w:tcPr>
-          <w:p>
-            <w:pPr>
-              <w:spacing w:after="0" w:line="240" w:lineRule="auto"/>
-              <w:jc w:val="center"/>
-            </w:pPr>
-            <w:r>
-              <w:rPr>
-                <w:rFonts w:ascii="Times New Roman" w:hAnsi="Times New Roman" w:eastAsia="Times New Roman"/>
-                <w:b w:val="0"/>
-                <w:sz w:val="13"/>
-              </w:rPr>
-              <w:t>103.29%</w:t>
-            </w:r>
-          </w:p>
-        </w:tc>
-        <w:tc>
-          <w:tcPr>
-            <w:tcW w:type="dxa" w:w="1928"/>
-            <w:vAlign w:val="center"/>
-          </w:tcPr>
-          <w:p>
-            <w:pPr>
-              <w:spacing w:after="0" w:line="240" w:lineRule="auto"/>
-              <w:jc w:val="center"/>
-            </w:pPr>
-            <w:r>
-              <w:rPr>
-                <w:rFonts w:ascii="Times New Roman" w:hAnsi="Times New Roman" w:eastAsia="Times New Roman"/>
-                <w:b w:val="0"/>
-                <w:sz w:val="13"/>
-              </w:rPr>
-              <w:t>82.78%</w:t>
-            </w:r>
-          </w:p>
-        </w:tc>
-        <w:tc>
-          <w:tcPr>
-            <w:tcW w:type="dxa" w:w="1928"/>
-            <w:vAlign w:val="center"/>
-          </w:tcPr>
-          <w:p>
-            <w:pPr>
-              <w:spacing w:after="0" w:line="240" w:lineRule="auto"/>
-              <w:jc w:val="center"/>
-            </w:pPr>
-            <w:r>
-              <w:rPr>
-                <w:rFonts w:ascii="Times New Roman" w:hAnsi="Times New Roman" w:eastAsia="Times New Roman"/>
-                <w:b w:val="0"/>
-                <w:sz w:val="13"/>
-              </w:rPr>
-              <w:t>94.71%</w:t>
+            <w:tcW w:type="dxa" w:w="604"/>
+            <w:vAlign w:val="center"/>
+          </w:tcPr>
+          <w:p>
+            <w:pPr>
+              <w:spacing w:after="0" w:line="240" w:lineRule="auto"/>
+              <w:jc w:val="center"/>
+            </w:pPr>
+            <w:r>
+              <w:rPr>
+                <w:rFonts w:ascii="Times New Roman" w:hAnsi="Times New Roman" w:eastAsia="Times New Roman"/>
+                <w:b w:val="0"/>
+                <w:sz w:val="10"/>
+              </w:rPr>
+              <w:t>L</w:t>
+            </w:r>
+          </w:p>
+        </w:tc>
+        <w:tc>
+          <w:tcPr>
+            <w:tcW w:type="dxa" w:w="892"/>
+            <w:vAlign w:val="center"/>
+          </w:tcPr>
+          <w:p>
+            <w:pPr>
+              <w:spacing w:after="0" w:line="240" w:lineRule="auto"/>
+              <w:jc w:val="center"/>
+            </w:pPr>
+            <w:r>
+              <w:rPr>
+                <w:rFonts w:ascii="Times New Roman" w:hAnsi="Times New Roman" w:eastAsia="Times New Roman"/>
+                <w:b w:val="0"/>
+                <w:sz w:val="10"/>
+              </w:rPr>
+              <w:t>103.29</w:t>
+            </w:r>
+          </w:p>
+        </w:tc>
+        <w:tc>
+          <w:tcPr>
+            <w:tcW w:type="dxa" w:w="864"/>
+            <w:vAlign w:val="center"/>
+          </w:tcPr>
+          <w:p>
+            <w:pPr>
+              <w:spacing w:after="0" w:line="240" w:lineRule="auto"/>
+              <w:jc w:val="center"/>
+            </w:pPr>
+            <w:r>
+              <w:rPr>
+                <w:rFonts w:ascii="Times New Roman" w:hAnsi="Times New Roman" w:eastAsia="Times New Roman"/>
+                <w:b w:val="0"/>
+                <w:sz w:val="10"/>
+              </w:rPr>
+              <w:t>82.78</w:t>
+            </w:r>
+          </w:p>
+        </w:tc>
+        <w:tc>
+          <w:tcPr>
+            <w:tcW w:type="dxa" w:w="892"/>
+            <w:vAlign w:val="center"/>
+          </w:tcPr>
+          <w:p>
+            <w:pPr>
+              <w:spacing w:after="0" w:line="240" w:lineRule="auto"/>
+              <w:jc w:val="center"/>
+            </w:pPr>
+            <w:r>
+              <w:rPr>
+                <w:rFonts w:ascii="Times New Roman" w:hAnsi="Times New Roman" w:eastAsia="Times New Roman"/>
+                <w:b w:val="0"/>
+                <w:sz w:val="10"/>
+              </w:rPr>
+              <w:t>94.71</w:t>
             </w:r>
           </w:p>
         </w:tc>
@@ -1729,19 +1740,19 @@
       <w:tr>
         <w:tc>
           <w:tcPr>
-            <w:tcW w:type="dxa" w:w="1928"/>
-            <w:vAlign w:val="center"/>
-          </w:tcPr>
-          <w:p>
-            <w:pPr>
-              <w:spacing w:after="0" w:line="240" w:lineRule="auto"/>
-              <w:jc w:val="center"/>
-            </w:pPr>
-            <w:r>
-              <w:rPr>
-                <w:rFonts w:ascii="Times New Roman" w:hAnsi="Times New Roman" w:eastAsia="Times New Roman"/>
-                <w:b w:val="0"/>
-                <w:sz w:val="13"/>
+            <w:tcW w:type="dxa" w:w="720"/>
+            <w:vAlign w:val="center"/>
+          </w:tcPr>
+          <w:p>
+            <w:pPr>
+              <w:spacing w:after="0" w:line="240" w:lineRule="auto"/>
+              <w:jc w:val="center"/>
+            </w:pPr>
+            <w:r>
+              <w:rPr>
+                <w:rFonts w:ascii="Times New Roman" w:hAnsi="Times New Roman" w:eastAsia="Times New Roman"/>
+                <w:b w:val="0"/>
+                <w:sz w:val="10"/>
               </w:rPr>
               <w:t>2026Q1</w:t>
             </w:r>
@@ -1749,81 +1760,81 @@
         </w:tc>
         <w:tc>
           <w:tcPr>
-            <w:tcW w:type="dxa" w:w="1928"/>
-            <w:vAlign w:val="center"/>
-          </w:tcPr>
-          <w:p>
-            <w:pPr>
-              <w:spacing w:after="0" w:line="240" w:lineRule="auto"/>
-              <w:jc w:val="center"/>
-            </w:pPr>
-            <w:r>
-              <w:rPr>
-                <w:rFonts w:ascii="Times New Roman" w:hAnsi="Times New Roman" w:eastAsia="Times New Roman"/>
-                <w:b w:val="0"/>
-                <w:sz w:val="13"/>
-              </w:rPr>
-              <w:t>Short</w:t>
-            </w:r>
-          </w:p>
-        </w:tc>
-        <w:tc>
-          <w:tcPr>
-            <w:tcW w:type="dxa" w:w="1928"/>
-            <w:vAlign w:val="center"/>
-          </w:tcPr>
-          <w:p>
-            <w:pPr>
-              <w:spacing w:after="0" w:line="240" w:lineRule="auto"/>
-              <w:jc w:val="center"/>
-            </w:pPr>
-            <w:r>
-              <w:rPr>
-                <w:rFonts w:ascii="Times New Roman" w:hAnsi="Times New Roman" w:eastAsia="Times New Roman"/>
-                <w:b w:val="0"/>
-                <w:sz w:val="13"/>
-              </w:rPr>
-              <w:t>15.40%</w:t>
-            </w:r>
-          </w:p>
-        </w:tc>
-        <w:tc>
-          <w:tcPr>
-            <w:tcW w:type="dxa" w:w="1928"/>
-            <w:vAlign w:val="center"/>
-          </w:tcPr>
-          <w:p>
-            <w:pPr>
-              <w:spacing w:after="0" w:line="240" w:lineRule="auto"/>
-              <w:jc w:val="center"/>
-            </w:pPr>
-            <w:r>
-              <w:rPr>
-                <w:rFonts w:ascii="Times New Roman" w:hAnsi="Times New Roman" w:eastAsia="Times New Roman"/>
-                <w:b w:val="0"/>
-                <w:sz w:val="13"/>
-              </w:rPr>
-              <w:t>24.62%</w:t>
-            </w:r>
-          </w:p>
-        </w:tc>
-        <w:tc>
-          <w:tcPr>
-            <w:tcW w:type="dxa" w:w="1928"/>
-            <w:vAlign w:val="center"/>
-          </w:tcPr>
-          <w:p>
-            <w:pPr>
-              <w:spacing w:after="0" w:line="240" w:lineRule="auto"/>
-              <w:jc w:val="center"/>
-            </w:pPr>
-            <w:r>
-              <w:rPr>
-                <w:rFonts w:ascii="Times New Roman" w:hAnsi="Times New Roman" w:eastAsia="Times New Roman"/>
-                <w:b w:val="0"/>
-                <w:sz w:val="13"/>
-              </w:rPr>
-              <w:t>8.55%</w:t>
+            <w:tcW w:type="dxa" w:w="604"/>
+            <w:vAlign w:val="center"/>
+          </w:tcPr>
+          <w:p>
+            <w:pPr>
+              <w:spacing w:after="0" w:line="240" w:lineRule="auto"/>
+              <w:jc w:val="center"/>
+            </w:pPr>
+            <w:r>
+              <w:rPr>
+                <w:rFonts w:ascii="Times New Roman" w:hAnsi="Times New Roman" w:eastAsia="Times New Roman"/>
+                <w:b w:val="0"/>
+                <w:sz w:val="10"/>
+              </w:rPr>
+              <w:t>S</w:t>
+            </w:r>
+          </w:p>
+        </w:tc>
+        <w:tc>
+          <w:tcPr>
+            <w:tcW w:type="dxa" w:w="892"/>
+            <w:vAlign w:val="center"/>
+          </w:tcPr>
+          <w:p>
+            <w:pPr>
+              <w:spacing w:after="0" w:line="240" w:lineRule="auto"/>
+              <w:jc w:val="center"/>
+            </w:pPr>
+            <w:r>
+              <w:rPr>
+                <w:rFonts w:ascii="Times New Roman" w:hAnsi="Times New Roman" w:eastAsia="Times New Roman"/>
+                <w:b w:val="0"/>
+                <w:sz w:val="10"/>
+              </w:rPr>
+              <w:t>15.40</w:t>
+            </w:r>
+          </w:p>
+        </w:tc>
+        <w:tc>
+          <w:tcPr>
+            <w:tcW w:type="dxa" w:w="864"/>
+            <w:vAlign w:val="center"/>
+          </w:tcPr>
+          <w:p>
+            <w:pPr>
+              <w:spacing w:after="0" w:line="240" w:lineRule="auto"/>
+              <w:jc w:val="center"/>
+            </w:pPr>
+            <w:r>
+              <w:rPr>
+                <w:rFonts w:ascii="Times New Roman" w:hAnsi="Times New Roman" w:eastAsia="Times New Roman"/>
+                <w:b w:val="0"/>
+                <w:sz w:val="10"/>
+              </w:rPr>
+              <w:t>24.62</w:t>
+            </w:r>
+          </w:p>
+        </w:tc>
+        <w:tc>
+          <w:tcPr>
+            <w:tcW w:type="dxa" w:w="892"/>
+            <w:vAlign w:val="center"/>
+          </w:tcPr>
+          <w:p>
+            <w:pPr>
+              <w:spacing w:after="0" w:line="240" w:lineRule="auto"/>
+              <w:jc w:val="center"/>
+            </w:pPr>
+            <w:r>
+              <w:rPr>
+                <w:rFonts w:ascii="Times New Roman" w:hAnsi="Times New Roman" w:eastAsia="Times New Roman"/>
+                <w:b w:val="0"/>
+                <w:sz w:val="10"/>
+              </w:rPr>
+              <w:t>8.55</w:t>
             </w:r>
           </w:p>
         </w:tc>
@@ -1831,19 +1842,19 @@
       <w:tr>
         <w:tc>
           <w:tcPr>
-            <w:tcW w:type="dxa" w:w="1928"/>
-            <w:vAlign w:val="center"/>
-          </w:tcPr>
-          <w:p>
-            <w:pPr>
-              <w:spacing w:after="0" w:line="240" w:lineRule="auto"/>
-              <w:jc w:val="center"/>
-            </w:pPr>
-            <w:r>
-              <w:rPr>
-                <w:rFonts w:ascii="Times New Roman" w:hAnsi="Times New Roman" w:eastAsia="Times New Roman"/>
-                <w:b w:val="0"/>
-                <w:sz w:val="13"/>
+            <w:tcW w:type="dxa" w:w="720"/>
+            <w:vAlign w:val="center"/>
+          </w:tcPr>
+          <w:p>
+            <w:pPr>
+              <w:spacing w:after="0" w:line="240" w:lineRule="auto"/>
+              <w:jc w:val="center"/>
+            </w:pPr>
+            <w:r>
+              <w:rPr>
+                <w:rFonts w:ascii="Times New Roman" w:hAnsi="Times New Roman" w:eastAsia="Times New Roman"/>
+                <w:b w:val="0"/>
+                <w:sz w:val="10"/>
               </w:rPr>
               <w:t>2026Q1</w:t>
             </w:r>
@@ -1851,81 +1862,81 @@
         </w:tc>
         <w:tc>
           <w:tcPr>
-            <w:tcW w:type="dxa" w:w="1928"/>
-            <w:vAlign w:val="center"/>
-          </w:tcPr>
-          <w:p>
-            <w:pPr>
-              <w:spacing w:after="0" w:line="240" w:lineRule="auto"/>
-              <w:jc w:val="center"/>
-            </w:pPr>
-            <w:r>
-              <w:rPr>
-                <w:rFonts w:ascii="Times New Roman" w:hAnsi="Times New Roman" w:eastAsia="Times New Roman"/>
-                <w:b w:val="0"/>
-                <w:sz w:val="13"/>
-              </w:rPr>
-              <w:t>Long</w:t>
-            </w:r>
-          </w:p>
-        </w:tc>
-        <w:tc>
-          <w:tcPr>
-            <w:tcW w:type="dxa" w:w="1928"/>
-            <w:vAlign w:val="center"/>
-          </w:tcPr>
-          <w:p>
-            <w:pPr>
-              <w:spacing w:after="0" w:line="240" w:lineRule="auto"/>
-              <w:jc w:val="center"/>
-            </w:pPr>
-            <w:r>
-              <w:rPr>
-                <w:rFonts w:ascii="Times New Roman" w:hAnsi="Times New Roman" w:eastAsia="Times New Roman"/>
-                <w:b w:val="0"/>
-                <w:sz w:val="13"/>
-              </w:rPr>
-              <w:t>14.20%</w:t>
-            </w:r>
-          </w:p>
-        </w:tc>
-        <w:tc>
-          <w:tcPr>
-            <w:tcW w:type="dxa" w:w="1928"/>
-            <w:vAlign w:val="center"/>
-          </w:tcPr>
-          <w:p>
-            <w:pPr>
-              <w:spacing w:after="0" w:line="240" w:lineRule="auto"/>
-              <w:jc w:val="center"/>
-            </w:pPr>
-            <w:r>
-              <w:rPr>
-                <w:rFonts w:ascii="Times New Roman" w:hAnsi="Times New Roman" w:eastAsia="Times New Roman"/>
-                <w:b w:val="0"/>
-                <w:sz w:val="13"/>
-              </w:rPr>
-              <w:t>6.14%</w:t>
-            </w:r>
-          </w:p>
-        </w:tc>
-        <w:tc>
-          <w:tcPr>
-            <w:tcW w:type="dxa" w:w="1928"/>
-            <w:vAlign w:val="center"/>
-          </w:tcPr>
-          <w:p>
-            <w:pPr>
-              <w:spacing w:after="0" w:line="240" w:lineRule="auto"/>
-              <w:jc w:val="center"/>
-            </w:pPr>
-            <w:r>
-              <w:rPr>
-                <w:rFonts w:ascii="Times New Roman" w:hAnsi="Times New Roman" w:eastAsia="Times New Roman"/>
-                <w:b w:val="0"/>
-                <w:sz w:val="13"/>
-              </w:rPr>
-              <w:t>0.00%</w:t>
+            <w:tcW w:type="dxa" w:w="604"/>
+            <w:vAlign w:val="center"/>
+          </w:tcPr>
+          <w:p>
+            <w:pPr>
+              <w:spacing w:after="0" w:line="240" w:lineRule="auto"/>
+              <w:jc w:val="center"/>
+            </w:pPr>
+            <w:r>
+              <w:rPr>
+                <w:rFonts w:ascii="Times New Roman" w:hAnsi="Times New Roman" w:eastAsia="Times New Roman"/>
+                <w:b w:val="0"/>
+                <w:sz w:val="10"/>
+              </w:rPr>
+              <w:t>L</w:t>
+            </w:r>
+          </w:p>
+        </w:tc>
+        <w:tc>
+          <w:tcPr>
+            <w:tcW w:type="dxa" w:w="892"/>
+            <w:vAlign w:val="center"/>
+          </w:tcPr>
+          <w:p>
+            <w:pPr>
+              <w:spacing w:after="0" w:line="240" w:lineRule="auto"/>
+              <w:jc w:val="center"/>
+            </w:pPr>
+            <w:r>
+              <w:rPr>
+                <w:rFonts w:ascii="Times New Roman" w:hAnsi="Times New Roman" w:eastAsia="Times New Roman"/>
+                <w:b w:val="0"/>
+                <w:sz w:val="10"/>
+              </w:rPr>
+              <w:t>14.20</w:t>
+            </w:r>
+          </w:p>
+        </w:tc>
+        <w:tc>
+          <w:tcPr>
+            <w:tcW w:type="dxa" w:w="864"/>
+            <w:vAlign w:val="center"/>
+          </w:tcPr>
+          <w:p>
+            <w:pPr>
+              <w:spacing w:after="0" w:line="240" w:lineRule="auto"/>
+              <w:jc w:val="center"/>
+            </w:pPr>
+            <w:r>
+              <w:rPr>
+                <w:rFonts w:ascii="Times New Roman" w:hAnsi="Times New Roman" w:eastAsia="Times New Roman"/>
+                <w:b w:val="0"/>
+                <w:sz w:val="10"/>
+              </w:rPr>
+              <w:t>6.14</w:t>
+            </w:r>
+          </w:p>
+        </w:tc>
+        <w:tc>
+          <w:tcPr>
+            <w:tcW w:type="dxa" w:w="892"/>
+            <w:vAlign w:val="center"/>
+          </w:tcPr>
+          <w:p>
+            <w:pPr>
+              <w:spacing w:after="0" w:line="240" w:lineRule="auto"/>
+              <w:jc w:val="center"/>
+            </w:pPr>
+            <w:r>
+              <w:rPr>
+                <w:rFonts w:ascii="Times New Roman" w:hAnsi="Times New Roman" w:eastAsia="Times New Roman"/>
+                <w:b w:val="0"/>
+                <w:sz w:val="10"/>
+              </w:rPr>
+              <w:t>0.00</w:t>
             </w:r>
           </w:p>
         </w:tc>
@@ -1961,24 +1972,22 @@
           <w:b w:val="0"/>
           <w:sz w:val="15"/>
         </w:rPr>
-        <w:t>Table 3. Temporal evidence leakage audit sample.</w:t>
+        <w:t>Table 3. Temporal evidence leakage audit sample (2026).</w:t>
       </w:r>
     </w:p>
     <w:tbl>
       <w:tblPr>
         <w:tblStyle w:val="af4"/>
-        <w:tblW w:type="auto" w:w="0"/>
+        <w:tblW w:type="dxa" w:w="3830"/>
         <w:jc w:val="center"/>
-        <w:tblLayout w:type="autofit"/>
+        <w:tblLayout w:type="fixed"/>
         <w:tblLook w:firstColumn="1" w:firstRow="1" w:lastColumn="0" w:lastRow="0" w:noHBand="0" w:noVBand="1" w:val="04A0"/>
       </w:tblPr>
       <w:tblGrid>
-        <w:gridCol w:w="1606"/>
-        <w:gridCol w:w="1606"/>
-        <w:gridCol w:w="1606"/>
-        <w:gridCol w:w="1606"/>
-        <w:gridCol w:w="1606"/>
-        <w:gridCol w:w="1606"/>
+        <w:gridCol w:w="2409"/>
+        <w:gridCol w:w="2409"/>
+        <w:gridCol w:w="2409"/>
+        <w:gridCol w:w="2409"/>
       </w:tblGrid>
       <w:tr>
         <w:trPr>
@@ -1986,7 +1995,7 @@
         </w:trPr>
         <w:tc>
           <w:tcPr>
-            <w:tcW w:type="dxa" w:w="1606"/>
+            <w:tcW w:type="dxa" w:w="892"/>
             <w:vAlign w:val="center"/>
             <w:shd w:fill="E9EEF4"/>
           </w:tcPr>
@@ -1999,7 +2008,7 @@
               <w:rPr>
                 <w:rFonts w:ascii="Times New Roman" w:hAnsi="Times New Roman" w:eastAsia="Times New Roman"/>
                 <w:b/>
-                <w:sz w:val="13"/>
+                <w:sz w:val="11"/>
               </w:rPr>
               <w:t>as_of</w:t>
             </w:r>
@@ -2007,7 +2016,7 @@
         </w:tc>
         <w:tc>
           <w:tcPr>
-            <w:tcW w:type="dxa" w:w="1606"/>
+            <w:tcW w:type="dxa" w:w="950"/>
             <w:vAlign w:val="center"/>
             <w:shd w:fill="E9EEF4"/>
           </w:tcPr>
@@ -2020,15 +2029,15 @@
               <w:rPr>
                 <w:rFonts w:ascii="Times New Roman" w:hAnsi="Times New Roman" w:eastAsia="Times New Roman"/>
                 <w:b/>
-                <w:sz w:val="13"/>
-              </w:rPr>
-              <w:t>Docs</w:t>
-            </w:r>
-          </w:p>
-        </w:tc>
-        <w:tc>
-          <w:tcPr>
-            <w:tcW w:type="dxa" w:w="1606"/>
+                <w:sz w:val="11"/>
+              </w:rPr>
+              <w:t>Max doc</w:t>
+            </w:r>
+          </w:p>
+        </w:tc>
+        <w:tc>
+          <w:tcPr>
+            <w:tcW w:type="dxa" w:w="950"/>
             <w:vAlign w:val="center"/>
             <w:shd w:fill="E9EEF4"/>
           </w:tcPr>
@@ -2041,15 +2050,15 @@
               <w:rPr>
                 <w:rFonts w:ascii="Times New Roman" w:hAnsi="Times New Roman" w:eastAsia="Times New Roman"/>
                 <w:b/>
-                <w:sz w:val="13"/>
-              </w:rPr>
-              <w:t>Max doc</w:t>
-            </w:r>
-          </w:p>
-        </w:tc>
-        <w:tc>
-          <w:tcPr>
-            <w:tcW w:type="dxa" w:w="1606"/>
+                <w:sz w:val="11"/>
+              </w:rPr>
+              <w:t>Max px</w:t>
+            </w:r>
+          </w:p>
+        </w:tc>
+        <w:tc>
+          <w:tcPr>
+            <w:tcW w:type="dxa" w:w="1036"/>
             <w:vAlign w:val="center"/>
             <w:shd w:fill="E9EEF4"/>
           </w:tcPr>
@@ -2062,49 +2071,7 @@
               <w:rPr>
                 <w:rFonts w:ascii="Times New Roman" w:hAnsi="Times New Roman" w:eastAsia="Times New Roman"/>
                 <w:b/>
-                <w:sz w:val="13"/>
-              </w:rPr>
-              <w:t>Prices</w:t>
-            </w:r>
-          </w:p>
-        </w:tc>
-        <w:tc>
-          <w:tcPr>
-            <w:tcW w:type="dxa" w:w="1606"/>
-            <w:vAlign w:val="center"/>
-            <w:shd w:fill="E9EEF4"/>
-          </w:tcPr>
-          <w:p>
-            <w:pPr>
-              <w:spacing w:after="0" w:line="240" w:lineRule="auto"/>
-              <w:jc w:val="center"/>
-            </w:pPr>
-            <w:r>
-              <w:rPr>
-                <w:rFonts w:ascii="Times New Roman" w:hAnsi="Times New Roman" w:eastAsia="Times New Roman"/>
-                <w:b/>
-                <w:sz w:val="13"/>
-              </w:rPr>
-              <w:t>Max price</w:t>
-            </w:r>
-          </w:p>
-        </w:tc>
-        <w:tc>
-          <w:tcPr>
-            <w:tcW w:type="dxa" w:w="1606"/>
-            <w:vAlign w:val="center"/>
-            <w:shd w:fill="E9EEF4"/>
-          </w:tcPr>
-          <w:p>
-            <w:pPr>
-              <w:spacing w:after="0" w:line="240" w:lineRule="auto"/>
-              <w:jc w:val="center"/>
-            </w:pPr>
-            <w:r>
-              <w:rPr>
-                <w:rFonts w:ascii="Times New Roman" w:hAnsi="Times New Roman" w:eastAsia="Times New Roman"/>
-                <w:b/>
-                <w:sz w:val="13"/>
+                <w:sz w:val="11"/>
               </w:rPr>
               <w:t>Future d/p</w:t>
             </w:r>
@@ -2114,119 +2081,79 @@
       <w:tr>
         <w:tc>
           <w:tcPr>
-            <w:tcW w:type="dxa" w:w="1606"/>
-            <w:vAlign w:val="center"/>
-          </w:tcPr>
-          <w:p>
-            <w:pPr>
-              <w:spacing w:after="0" w:line="240" w:lineRule="auto"/>
-              <w:jc w:val="center"/>
-            </w:pPr>
-            <w:r>
-              <w:rPr>
-                <w:rFonts w:ascii="Times New Roman" w:hAnsi="Times New Roman" w:eastAsia="Times New Roman"/>
-                <w:b w:val="0"/>
-                <w:sz w:val="13"/>
-              </w:rPr>
-              <w:t>2026-05-20</w:t>
-            </w:r>
-          </w:p>
-        </w:tc>
-        <w:tc>
-          <w:tcPr>
-            <w:tcW w:type="dxa" w:w="1606"/>
-            <w:vAlign w:val="center"/>
-          </w:tcPr>
-          <w:p>
-            <w:pPr>
-              <w:spacing w:after="0" w:line="240" w:lineRule="auto"/>
-              <w:jc w:val="center"/>
-            </w:pPr>
-            <w:r>
-              <w:rPr>
-                <w:rFonts w:ascii="Times New Roman" w:hAnsi="Times New Roman" w:eastAsia="Times New Roman"/>
-                <w:b w:val="0"/>
-                <w:sz w:val="13"/>
-              </w:rPr>
-              <w:t>847</w:t>
-            </w:r>
-          </w:p>
-        </w:tc>
-        <w:tc>
-          <w:tcPr>
-            <w:tcW w:type="dxa" w:w="1606"/>
-            <w:vAlign w:val="center"/>
-          </w:tcPr>
-          <w:p>
-            <w:pPr>
-              <w:spacing w:after="0" w:line="240" w:lineRule="auto"/>
-              <w:jc w:val="center"/>
-            </w:pPr>
-            <w:r>
-              <w:rPr>
-                <w:rFonts w:ascii="Times New Roman" w:hAnsi="Times New Roman" w:eastAsia="Times New Roman"/>
-                <w:b w:val="0"/>
-                <w:sz w:val="13"/>
-              </w:rPr>
-              <w:t>2026-05-20</w:t>
-            </w:r>
-          </w:p>
-        </w:tc>
-        <w:tc>
-          <w:tcPr>
-            <w:tcW w:type="dxa" w:w="1606"/>
-            <w:vAlign w:val="center"/>
-          </w:tcPr>
-          <w:p>
-            <w:pPr>
-              <w:spacing w:after="0" w:line="240" w:lineRule="auto"/>
-              <w:jc w:val="center"/>
-            </w:pPr>
-            <w:r>
-              <w:rPr>
-                <w:rFonts w:ascii="Times New Roman" w:hAnsi="Times New Roman" w:eastAsia="Times New Roman"/>
-                <w:b w:val="0"/>
-                <w:sz w:val="13"/>
-              </w:rPr>
-              <w:t>400</w:t>
-            </w:r>
-          </w:p>
-        </w:tc>
-        <w:tc>
-          <w:tcPr>
-            <w:tcW w:type="dxa" w:w="1606"/>
-            <w:vAlign w:val="center"/>
-          </w:tcPr>
-          <w:p>
-            <w:pPr>
-              <w:spacing w:after="0" w:line="240" w:lineRule="auto"/>
-              <w:jc w:val="center"/>
-            </w:pPr>
-            <w:r>
-              <w:rPr>
-                <w:rFonts w:ascii="Times New Roman" w:hAnsi="Times New Roman" w:eastAsia="Times New Roman"/>
-                <w:b w:val="0"/>
-                <w:sz w:val="13"/>
-              </w:rPr>
-              <w:t>2026-05-20</w:t>
-            </w:r>
-          </w:p>
-        </w:tc>
-        <w:tc>
-          <w:tcPr>
-            <w:tcW w:type="dxa" w:w="1606"/>
-            <w:vAlign w:val="center"/>
-          </w:tcPr>
-          <w:p>
-            <w:pPr>
-              <w:spacing w:after="0" w:line="240" w:lineRule="auto"/>
-              <w:jc w:val="center"/>
-            </w:pPr>
-            <w:r>
-              <w:rPr>
-                <w:rFonts w:ascii="Times New Roman" w:hAnsi="Times New Roman" w:eastAsia="Times New Roman"/>
-                <w:b w:val="0"/>
-                <w:sz w:val="13"/>
+            <w:tcW w:type="dxa" w:w="892"/>
+            <w:vAlign w:val="center"/>
+          </w:tcPr>
+          <w:p>
+            <w:pPr>
+              <w:spacing w:after="0" w:line="240" w:lineRule="auto"/>
+              <w:jc w:val="center"/>
+            </w:pPr>
+            <w:r>
+              <w:rPr>
+                <w:rFonts w:ascii="Times New Roman" w:hAnsi="Times New Roman" w:eastAsia="Times New Roman"/>
+                <w:b w:val="0"/>
+                <w:sz w:val="11"/>
+              </w:rPr>
+              <w:t>05-20</w:t>
+            </w:r>
+          </w:p>
+        </w:tc>
+        <w:tc>
+          <w:tcPr>
+            <w:tcW w:type="dxa" w:w="950"/>
+            <w:vAlign w:val="center"/>
+          </w:tcPr>
+          <w:p>
+            <w:pPr>
+              <w:spacing w:after="0" w:line="240" w:lineRule="auto"/>
+              <w:jc w:val="center"/>
+            </w:pPr>
+            <w:r>
+              <w:rPr>
+                <w:rFonts w:ascii="Times New Roman" w:hAnsi="Times New Roman" w:eastAsia="Times New Roman"/>
+                <w:b w:val="0"/>
+                <w:sz w:val="11"/>
+              </w:rPr>
+              <w:t>05-20</w:t>
+            </w:r>
+          </w:p>
+        </w:tc>
+        <w:tc>
+          <w:tcPr>
+            <w:tcW w:type="dxa" w:w="950"/>
+            <w:vAlign w:val="center"/>
+          </w:tcPr>
+          <w:p>
+            <w:pPr>
+              <w:spacing w:after="0" w:line="240" w:lineRule="auto"/>
+              <w:jc w:val="center"/>
+            </w:pPr>
+            <w:r>
+              <w:rPr>
+                <w:rFonts w:ascii="Times New Roman" w:hAnsi="Times New Roman" w:eastAsia="Times New Roman"/>
+                <w:b w:val="0"/>
+                <w:sz w:val="11"/>
+              </w:rPr>
+              <w:t>05-20</w:t>
+            </w:r>
+          </w:p>
+        </w:tc>
+        <w:tc>
+          <w:tcPr>
+            <w:tcW w:type="dxa" w:w="1036"/>
+            <w:vAlign w:val="center"/>
+          </w:tcPr>
+          <w:p>
+            <w:pPr>
+              <w:spacing w:after="0" w:line="240" w:lineRule="auto"/>
+              <w:jc w:val="center"/>
+            </w:pPr>
+            <w:r>
+              <w:rPr>
+                <w:rFonts w:ascii="Times New Roman" w:hAnsi="Times New Roman" w:eastAsia="Times New Roman"/>
+                <w:b w:val="0"/>
+                <w:sz w:val="11"/>
               </w:rPr>
               <w:t>6151/650</w:t>
             </w:r>
@@ -2236,119 +2163,79 @@
       <w:tr>
         <w:tc>
           <w:tcPr>
-            <w:tcW w:type="dxa" w:w="1606"/>
-            <w:vAlign w:val="center"/>
-          </w:tcPr>
-          <w:p>
-            <w:pPr>
-              <w:spacing w:after="0" w:line="240" w:lineRule="auto"/>
-              <w:jc w:val="center"/>
-            </w:pPr>
-            <w:r>
-              <w:rPr>
-                <w:rFonts w:ascii="Times New Roman" w:hAnsi="Times New Roman" w:eastAsia="Times New Roman"/>
-                <w:b w:val="0"/>
-                <w:sz w:val="13"/>
-              </w:rPr>
-              <w:t>2026-05-31</w:t>
-            </w:r>
-          </w:p>
-        </w:tc>
-        <w:tc>
-          <w:tcPr>
-            <w:tcW w:type="dxa" w:w="1606"/>
-            <w:vAlign w:val="center"/>
-          </w:tcPr>
-          <w:p>
-            <w:pPr>
-              <w:spacing w:after="0" w:line="240" w:lineRule="auto"/>
-              <w:jc w:val="center"/>
-            </w:pPr>
-            <w:r>
-              <w:rPr>
-                <w:rFonts w:ascii="Times New Roman" w:hAnsi="Times New Roman" w:eastAsia="Times New Roman"/>
-                <w:b w:val="0"/>
-                <w:sz w:val="13"/>
-              </w:rPr>
-              <w:t>2130</w:t>
-            </w:r>
-          </w:p>
-        </w:tc>
-        <w:tc>
-          <w:tcPr>
-            <w:tcW w:type="dxa" w:w="1606"/>
-            <w:vAlign w:val="center"/>
-          </w:tcPr>
-          <w:p>
-            <w:pPr>
-              <w:spacing w:after="0" w:line="240" w:lineRule="auto"/>
-              <w:jc w:val="center"/>
-            </w:pPr>
-            <w:r>
-              <w:rPr>
-                <w:rFonts w:ascii="Times New Roman" w:hAnsi="Times New Roman" w:eastAsia="Times New Roman"/>
-                <w:b w:val="0"/>
-                <w:sz w:val="13"/>
-              </w:rPr>
-              <w:t>2026-05-31</w:t>
-            </w:r>
-          </w:p>
-        </w:tc>
-        <w:tc>
-          <w:tcPr>
-            <w:tcW w:type="dxa" w:w="1606"/>
-            <w:vAlign w:val="center"/>
-          </w:tcPr>
-          <w:p>
-            <w:pPr>
-              <w:spacing w:after="0" w:line="240" w:lineRule="auto"/>
-              <w:jc w:val="center"/>
-            </w:pPr>
-            <w:r>
-              <w:rPr>
-                <w:rFonts w:ascii="Times New Roman" w:hAnsi="Times New Roman" w:eastAsia="Times New Roman"/>
-                <w:b w:val="0"/>
-                <w:sz w:val="13"/>
-              </w:rPr>
-              <w:t>700</w:t>
-            </w:r>
-          </w:p>
-        </w:tc>
-        <w:tc>
-          <w:tcPr>
-            <w:tcW w:type="dxa" w:w="1606"/>
-            <w:vAlign w:val="center"/>
-          </w:tcPr>
-          <w:p>
-            <w:pPr>
-              <w:spacing w:after="0" w:line="240" w:lineRule="auto"/>
-              <w:jc w:val="center"/>
-            </w:pPr>
-            <w:r>
-              <w:rPr>
-                <w:rFonts w:ascii="Times New Roman" w:hAnsi="Times New Roman" w:eastAsia="Times New Roman"/>
-                <w:b w:val="0"/>
-                <w:sz w:val="13"/>
-              </w:rPr>
-              <w:t>2026-05-29</w:t>
-            </w:r>
-          </w:p>
-        </w:tc>
-        <w:tc>
-          <w:tcPr>
-            <w:tcW w:type="dxa" w:w="1606"/>
-            <w:vAlign w:val="center"/>
-          </w:tcPr>
-          <w:p>
-            <w:pPr>
-              <w:spacing w:after="0" w:line="240" w:lineRule="auto"/>
-              <w:jc w:val="center"/>
-            </w:pPr>
-            <w:r>
-              <w:rPr>
-                <w:rFonts w:ascii="Times New Roman" w:hAnsi="Times New Roman" w:eastAsia="Times New Roman"/>
-                <w:b w:val="0"/>
-                <w:sz w:val="13"/>
+            <w:tcW w:type="dxa" w:w="892"/>
+            <w:vAlign w:val="center"/>
+          </w:tcPr>
+          <w:p>
+            <w:pPr>
+              <w:spacing w:after="0" w:line="240" w:lineRule="auto"/>
+              <w:jc w:val="center"/>
+            </w:pPr>
+            <w:r>
+              <w:rPr>
+                <w:rFonts w:ascii="Times New Roman" w:hAnsi="Times New Roman" w:eastAsia="Times New Roman"/>
+                <w:b w:val="0"/>
+                <w:sz w:val="11"/>
+              </w:rPr>
+              <w:t>05-31</w:t>
+            </w:r>
+          </w:p>
+        </w:tc>
+        <w:tc>
+          <w:tcPr>
+            <w:tcW w:type="dxa" w:w="950"/>
+            <w:vAlign w:val="center"/>
+          </w:tcPr>
+          <w:p>
+            <w:pPr>
+              <w:spacing w:after="0" w:line="240" w:lineRule="auto"/>
+              <w:jc w:val="center"/>
+            </w:pPr>
+            <w:r>
+              <w:rPr>
+                <w:rFonts w:ascii="Times New Roman" w:hAnsi="Times New Roman" w:eastAsia="Times New Roman"/>
+                <w:b w:val="0"/>
+                <w:sz w:val="11"/>
+              </w:rPr>
+              <w:t>05-31</w:t>
+            </w:r>
+          </w:p>
+        </w:tc>
+        <w:tc>
+          <w:tcPr>
+            <w:tcW w:type="dxa" w:w="950"/>
+            <w:vAlign w:val="center"/>
+          </w:tcPr>
+          <w:p>
+            <w:pPr>
+              <w:spacing w:after="0" w:line="240" w:lineRule="auto"/>
+              <w:jc w:val="center"/>
+            </w:pPr>
+            <w:r>
+              <w:rPr>
+                <w:rFonts w:ascii="Times New Roman" w:hAnsi="Times New Roman" w:eastAsia="Times New Roman"/>
+                <w:b w:val="0"/>
+                <w:sz w:val="11"/>
+              </w:rPr>
+              <w:t>05-29</w:t>
+            </w:r>
+          </w:p>
+        </w:tc>
+        <w:tc>
+          <w:tcPr>
+            <w:tcW w:type="dxa" w:w="1036"/>
+            <w:vAlign w:val="center"/>
+          </w:tcPr>
+          <w:p>
+            <w:pPr>
+              <w:spacing w:after="0" w:line="240" w:lineRule="auto"/>
+              <w:jc w:val="center"/>
+            </w:pPr>
+            <w:r>
+              <w:rPr>
+                <w:rFonts w:ascii="Times New Roman" w:hAnsi="Times New Roman" w:eastAsia="Times New Roman"/>
+                <w:b w:val="0"/>
+                <w:sz w:val="11"/>
               </w:rPr>
               <w:t>4868/350</w:t>
             </w:r>
@@ -2358,119 +2245,79 @@
       <w:tr>
         <w:tc>
           <w:tcPr>
-            <w:tcW w:type="dxa" w:w="1606"/>
-            <w:vAlign w:val="center"/>
-          </w:tcPr>
-          <w:p>
-            <w:pPr>
-              <w:spacing w:after="0" w:line="240" w:lineRule="auto"/>
-              <w:jc w:val="center"/>
-            </w:pPr>
-            <w:r>
-              <w:rPr>
-                <w:rFonts w:ascii="Times New Roman" w:hAnsi="Times New Roman" w:eastAsia="Times New Roman"/>
-                <w:b w:val="0"/>
-                <w:sz w:val="13"/>
-              </w:rPr>
-              <w:t>2026-06-10</w:t>
-            </w:r>
-          </w:p>
-        </w:tc>
-        <w:tc>
-          <w:tcPr>
-            <w:tcW w:type="dxa" w:w="1606"/>
-            <w:vAlign w:val="center"/>
-          </w:tcPr>
-          <w:p>
-            <w:pPr>
-              <w:spacing w:after="0" w:line="240" w:lineRule="auto"/>
-              <w:jc w:val="center"/>
-            </w:pPr>
-            <w:r>
-              <w:rPr>
-                <w:rFonts w:ascii="Times New Roman" w:hAnsi="Times New Roman" w:eastAsia="Times New Roman"/>
-                <w:b w:val="0"/>
-                <w:sz w:val="13"/>
-              </w:rPr>
-              <w:t>6998</w:t>
-            </w:r>
-          </w:p>
-        </w:tc>
-        <w:tc>
-          <w:tcPr>
-            <w:tcW w:type="dxa" w:w="1606"/>
-            <w:vAlign w:val="center"/>
-          </w:tcPr>
-          <w:p>
-            <w:pPr>
-              <w:spacing w:after="0" w:line="240" w:lineRule="auto"/>
-              <w:jc w:val="center"/>
-            </w:pPr>
-            <w:r>
-              <w:rPr>
-                <w:rFonts w:ascii="Times New Roman" w:hAnsi="Times New Roman" w:eastAsia="Times New Roman"/>
-                <w:b w:val="0"/>
-                <w:sz w:val="13"/>
-              </w:rPr>
-              <w:t>2026-06-10</w:t>
-            </w:r>
-          </w:p>
-        </w:tc>
-        <w:tc>
-          <w:tcPr>
-            <w:tcW w:type="dxa" w:w="1606"/>
-            <w:vAlign w:val="center"/>
-          </w:tcPr>
-          <w:p>
-            <w:pPr>
-              <w:spacing w:after="0" w:line="240" w:lineRule="auto"/>
-              <w:jc w:val="center"/>
-            </w:pPr>
-            <w:r>
-              <w:rPr>
-                <w:rFonts w:ascii="Times New Roman" w:hAnsi="Times New Roman" w:eastAsia="Times New Roman"/>
-                <w:b w:val="0"/>
-                <w:sz w:val="13"/>
-              </w:rPr>
-              <w:t>1050</w:t>
-            </w:r>
-          </w:p>
-        </w:tc>
-        <w:tc>
-          <w:tcPr>
-            <w:tcW w:type="dxa" w:w="1606"/>
-            <w:vAlign w:val="center"/>
-          </w:tcPr>
-          <w:p>
-            <w:pPr>
-              <w:spacing w:after="0" w:line="240" w:lineRule="auto"/>
-              <w:jc w:val="center"/>
-            </w:pPr>
-            <w:r>
-              <w:rPr>
-                <w:rFonts w:ascii="Times New Roman" w:hAnsi="Times New Roman" w:eastAsia="Times New Roman"/>
-                <w:b w:val="0"/>
-                <w:sz w:val="13"/>
-              </w:rPr>
-              <w:t>2026-06-10</w:t>
-            </w:r>
-          </w:p>
-        </w:tc>
-        <w:tc>
-          <w:tcPr>
-            <w:tcW w:type="dxa" w:w="1606"/>
-            <w:vAlign w:val="center"/>
-          </w:tcPr>
-          <w:p>
-            <w:pPr>
-              <w:spacing w:after="0" w:line="240" w:lineRule="auto"/>
-              <w:jc w:val="center"/>
-            </w:pPr>
-            <w:r>
-              <w:rPr>
-                <w:rFonts w:ascii="Times New Roman" w:hAnsi="Times New Roman" w:eastAsia="Times New Roman"/>
-                <w:b w:val="0"/>
-                <w:sz w:val="13"/>
+            <w:tcW w:type="dxa" w:w="892"/>
+            <w:vAlign w:val="center"/>
+          </w:tcPr>
+          <w:p>
+            <w:pPr>
+              <w:spacing w:after="0" w:line="240" w:lineRule="auto"/>
+              <w:jc w:val="center"/>
+            </w:pPr>
+            <w:r>
+              <w:rPr>
+                <w:rFonts w:ascii="Times New Roman" w:hAnsi="Times New Roman" w:eastAsia="Times New Roman"/>
+                <w:b w:val="0"/>
+                <w:sz w:val="11"/>
+              </w:rPr>
+              <w:t>06-10</w:t>
+            </w:r>
+          </w:p>
+        </w:tc>
+        <w:tc>
+          <w:tcPr>
+            <w:tcW w:type="dxa" w:w="950"/>
+            <w:vAlign w:val="center"/>
+          </w:tcPr>
+          <w:p>
+            <w:pPr>
+              <w:spacing w:after="0" w:line="240" w:lineRule="auto"/>
+              <w:jc w:val="center"/>
+            </w:pPr>
+            <w:r>
+              <w:rPr>
+                <w:rFonts w:ascii="Times New Roman" w:hAnsi="Times New Roman" w:eastAsia="Times New Roman"/>
+                <w:b w:val="0"/>
+                <w:sz w:val="11"/>
+              </w:rPr>
+              <w:t>06-10</w:t>
+            </w:r>
+          </w:p>
+        </w:tc>
+        <w:tc>
+          <w:tcPr>
+            <w:tcW w:type="dxa" w:w="950"/>
+            <w:vAlign w:val="center"/>
+          </w:tcPr>
+          <w:p>
+            <w:pPr>
+              <w:spacing w:after="0" w:line="240" w:lineRule="auto"/>
+              <w:jc w:val="center"/>
+            </w:pPr>
+            <w:r>
+              <w:rPr>
+                <w:rFonts w:ascii="Times New Roman" w:hAnsi="Times New Roman" w:eastAsia="Times New Roman"/>
+                <w:b w:val="0"/>
+                <w:sz w:val="11"/>
+              </w:rPr>
+              <w:t>06-10</w:t>
+            </w:r>
+          </w:p>
+        </w:tc>
+        <w:tc>
+          <w:tcPr>
+            <w:tcW w:type="dxa" w:w="1036"/>
+            <w:vAlign w:val="center"/>
+          </w:tcPr>
+          <w:p>
+            <w:pPr>
+              <w:spacing w:after="0" w:line="240" w:lineRule="auto"/>
+              <w:jc w:val="center"/>
+            </w:pPr>
+            <w:r>
+              <w:rPr>
+                <w:rFonts w:ascii="Times New Roman" w:hAnsi="Times New Roman" w:eastAsia="Times New Roman"/>
+                <w:b w:val="0"/>
+                <w:sz w:val="11"/>
               </w:rPr>
               <w:t>0/0</w:t>
             </w:r>
@@ -2500,6 +2347,7 @@
     <w:p>
       <w:pPr>
         <w:pStyle w:val="af1"/>
+        <w:keepNext/>
         <w:spacing w:after="100" w:line="252" w:lineRule="auto" w:before="100"/>
       </w:pPr>
       <w:r>
@@ -2542,6 +2390,7 @@
     <w:p>
       <w:pPr>
         <w:pStyle w:val="af1"/>
+        <w:keepNext/>
         <w:spacing w:after="100" w:line="252" w:lineRule="auto" w:before="100"/>
       </w:pPr>
       <w:r>
@@ -2570,6 +2419,7 @@
     <w:p>
       <w:pPr>
         <w:pStyle w:val="af1"/>
+        <w:keepNext/>
         <w:spacing w:after="100" w:line="252" w:lineRule="auto" w:before="100"/>
       </w:pPr>
       <w:r>
@@ -2661,169 +2511,15 @@
     <w:pPr>
       <w:pStyle w:val="ac"/>
       <w:ind w:firstLine="0"/>
+      <w:jc w:val="left"/>
     </w:pPr>
     <w:r>
       <w:rPr>
-        <w:b/>
-        <w:bCs/>
+        <w:rFonts w:ascii="Times New Roman" w:hAnsi="Times New Roman" w:eastAsia="굴림"/>
+        <w:b w:val="0"/>
         <w:sz w:val="16"/>
-        <w:szCs w:val="18"/>
       </w:rPr>
-      <w:t>*</w:t>
-    </w:r>
-    <w:r>
-      <w:rPr>
-        <w:rFonts w:eastAsia="굴림"/>
-        <w:b/>
-        <w:bCs/>
-        <w:sz w:val="16"/>
-        <w:szCs w:val="18"/>
-      </w:rPr>
-      <w:t>발표자</w:t>
-    </w:r>
-    <w:r>
-      <w:rPr>
-        <w:rFonts w:eastAsia="굴림" w:hint="eastAsia"/>
-        <w:color w:val="000000" w:themeColor="text1"/>
-        <w:sz w:val="16"/>
-        <w:szCs w:val="18"/>
-      </w:rPr>
-      <w:t>(abc@cde.or.kr)</w:t>
-    </w:r>
-    <w:r>
-      <w:rPr>
-        <w:rFonts w:eastAsia="굴림"/>
-        <w:color w:val="000000" w:themeColor="text1"/>
-        <w:sz w:val="16"/>
-        <w:szCs w:val="18"/>
-      </w:rPr>
-      <w:t>,</w:t>
-    </w:r>
-    <w:r>
-      <w:rPr>
-        <w:rFonts w:eastAsia="굴림"/>
-        <w:b/>
-        <w:bCs/>
-        <w:sz w:val="16"/>
-        <w:szCs w:val="18"/>
-      </w:rPr>
-      <w:t xml:space="preserve"> </w:t>
-    </w:r>
-    <w:r>
-      <w:rPr>
-        <w:rFonts w:eastAsia="굴림"/>
-        <w:b/>
-        <w:bCs/>
-        <w:sz w:val="16"/>
-        <w:szCs w:val="18"/>
-        <w:vertAlign w:val="superscript"/>
-      </w:rPr>
-      <w:t>#</w:t>
-    </w:r>
-    <w:r>
-      <w:rPr>
-        <w:rFonts w:eastAsia="굴림"/>
-        <w:b/>
-        <w:bCs/>
-        <w:sz w:val="16"/>
-        <w:szCs w:val="18"/>
-      </w:rPr>
-      <w:t>교신저자</w:t>
-    </w:r>
-    <w:r>
-      <w:rPr>
-        <w:color w:val="000000" w:themeColor="text1"/>
-        <w:sz w:val="16"/>
-        <w:szCs w:val="18"/>
-      </w:rPr>
-      <w:t>(</w:t>
-    </w:r>
-    <w:proofErr w:type="gramStart"/>
-    <w:r>
-      <w:rPr>
-        <w:color w:val="000000" w:themeColor="text1"/>
-        <w:sz w:val="16"/>
-        <w:szCs w:val="18"/>
-      </w:rPr>
-      <w:t>abcd@cde.or</w:t>
-    </w:r>
-    <w:r>
-      <w:rPr>
-        <w:color w:val="000000" w:themeColor="text1"/>
-        <w:sz w:val="16"/>
-        <w:szCs w:val="18"/>
-      </w:rPr>
-      <w:t>.kr )</w:t>
-    </w:r>
-    <w:proofErr w:type="gramEnd"/>
-    <w:r>
-      <w:rPr>
-        <w:color w:val="000000" w:themeColor="text1"/>
-        <w:sz w:val="16"/>
-        <w:szCs w:val="18"/>
-      </w:rPr>
-      <w:t xml:space="preserve"> </w:t>
-    </w:r>
-    <w:r>
-      <w:rPr>
-        <w:color w:val="FF0000"/>
-        <w:sz w:val="18"/>
-        <w:szCs w:val="18"/>
-      </w:rPr>
-      <w:t>[</w:t>
-    </w:r>
-    <w:r>
-      <w:rPr>
-        <w:rFonts w:hint="eastAsia"/>
-        <w:color w:val="FF0000"/>
-        <w:sz w:val="18"/>
-        <w:szCs w:val="18"/>
-      </w:rPr>
-      <w:t>이메일</w:t>
-    </w:r>
-    <w:r>
-      <w:rPr>
-        <w:rFonts w:hint="eastAsia"/>
-        <w:color w:val="FF0000"/>
-        <w:sz w:val="18"/>
-        <w:szCs w:val="18"/>
-      </w:rPr>
-      <w:t xml:space="preserve"> </w:t>
-    </w:r>
-    <w:r>
-      <w:rPr>
-        <w:rFonts w:hint="eastAsia"/>
-        <w:color w:val="FF0000"/>
-        <w:sz w:val="18"/>
-        <w:szCs w:val="18"/>
-      </w:rPr>
-      <w:t>주소만</w:t>
-    </w:r>
-    <w:r>
-      <w:rPr>
-        <w:rFonts w:hint="eastAsia"/>
-        <w:color w:val="FF0000"/>
-        <w:sz w:val="18"/>
-        <w:szCs w:val="18"/>
-      </w:rPr>
-      <w:t xml:space="preserve"> </w:t>
-    </w:r>
-    <w:r>
-      <w:rPr>
-        <w:rFonts w:hint="eastAsia"/>
-        <w:color w:val="FF0000"/>
-        <w:sz w:val="18"/>
-        <w:szCs w:val="18"/>
-      </w:rPr>
-      <w:t>변경</w:t>
-    </w:r>
-    <w:r>
-      <w:rPr>
-        <w:color w:val="FF0000"/>
-        <w:sz w:val="18"/>
-        <w:szCs w:val="18"/>
-      </w:rPr>
-      <w:t>]</w:t>
+      <w:t>*발표자(leedohoun@kw.ac.kr), #교신저자(leedohoun@kw.ac.kr)</w:t>
     </w:r>
   </w:p>
 </w:ftr>
@@ -2835,169 +2531,15 @@
     <w:pPr>
       <w:pStyle w:val="ac"/>
       <w:ind w:firstLine="0"/>
+      <w:jc w:val="left"/>
     </w:pPr>
     <w:r>
       <w:rPr>
-        <w:b/>
-        <w:bCs/>
+        <w:rFonts w:ascii="Times New Roman" w:hAnsi="Times New Roman" w:eastAsia="굴림"/>
+        <w:b w:val="0"/>
         <w:sz w:val="16"/>
-        <w:szCs w:val="18"/>
       </w:rPr>
-      <w:t>*</w:t>
-    </w:r>
-    <w:r>
-      <w:rPr>
-        <w:rFonts w:eastAsia="굴림"/>
-        <w:b/>
-        <w:bCs/>
-        <w:sz w:val="16"/>
-        <w:szCs w:val="18"/>
-      </w:rPr>
-      <w:t>발표자</w:t>
-    </w:r>
-    <w:r>
-      <w:rPr>
-        <w:rFonts w:eastAsia="굴림" w:hint="eastAsia"/>
-        <w:color w:val="000000" w:themeColor="text1"/>
-        <w:sz w:val="16"/>
-        <w:szCs w:val="18"/>
-      </w:rPr>
-      <w:t>(abc@cde.or.kr)</w:t>
-    </w:r>
-    <w:r>
-      <w:rPr>
-        <w:rFonts w:eastAsia="굴림"/>
-        <w:color w:val="000000" w:themeColor="text1"/>
-        <w:sz w:val="16"/>
-        <w:szCs w:val="18"/>
-      </w:rPr>
-      <w:t>,</w:t>
-    </w:r>
-    <w:r>
-      <w:rPr>
-        <w:rFonts w:eastAsia="굴림"/>
-        <w:b/>
-        <w:bCs/>
-        <w:sz w:val="16"/>
-        <w:szCs w:val="18"/>
-      </w:rPr>
-      <w:t xml:space="preserve"> </w:t>
-    </w:r>
-    <w:r>
-      <w:rPr>
-        <w:rFonts w:eastAsia="굴림"/>
-        <w:b/>
-        <w:bCs/>
-        <w:sz w:val="16"/>
-        <w:szCs w:val="18"/>
-        <w:vertAlign w:val="superscript"/>
-      </w:rPr>
-      <w:t>#</w:t>
-    </w:r>
-    <w:r>
-      <w:rPr>
-        <w:rFonts w:eastAsia="굴림"/>
-        <w:b/>
-        <w:bCs/>
-        <w:sz w:val="16"/>
-        <w:szCs w:val="18"/>
-      </w:rPr>
-      <w:t>교신저자</w:t>
-    </w:r>
-    <w:r>
-      <w:rPr>
-        <w:color w:val="000000" w:themeColor="text1"/>
-        <w:sz w:val="16"/>
-        <w:szCs w:val="18"/>
-      </w:rPr>
-      <w:t>(</w:t>
-    </w:r>
-    <w:proofErr w:type="gramStart"/>
-    <w:r>
-      <w:rPr>
-        <w:color w:val="000000" w:themeColor="text1"/>
-        <w:sz w:val="16"/>
-        <w:szCs w:val="18"/>
-      </w:rPr>
-      <w:t>abcd@cde.or</w:t>
-    </w:r>
-    <w:r>
-      <w:rPr>
-        <w:color w:val="000000" w:themeColor="text1"/>
-        <w:sz w:val="16"/>
-        <w:szCs w:val="18"/>
-      </w:rPr>
-      <w:t>.kr )</w:t>
-    </w:r>
-    <w:proofErr w:type="gramEnd"/>
-    <w:r>
-      <w:rPr>
-        <w:color w:val="000000" w:themeColor="text1"/>
-        <w:sz w:val="16"/>
-        <w:szCs w:val="18"/>
-      </w:rPr>
-      <w:t xml:space="preserve"> </w:t>
-    </w:r>
-    <w:r>
-      <w:rPr>
-        <w:color w:val="FF0000"/>
-        <w:sz w:val="18"/>
-        <w:szCs w:val="18"/>
-      </w:rPr>
-      <w:t>[</w:t>
-    </w:r>
-    <w:r>
-      <w:rPr>
-        <w:rFonts w:hint="eastAsia"/>
-        <w:color w:val="FF0000"/>
-        <w:sz w:val="18"/>
-        <w:szCs w:val="18"/>
-      </w:rPr>
-      <w:t>이메일</w:t>
-    </w:r>
-    <w:r>
-      <w:rPr>
-        <w:rFonts w:hint="eastAsia"/>
-        <w:color w:val="FF0000"/>
-        <w:sz w:val="18"/>
-        <w:szCs w:val="18"/>
-      </w:rPr>
-      <w:t xml:space="preserve"> </w:t>
-    </w:r>
-    <w:r>
-      <w:rPr>
-        <w:rFonts w:hint="eastAsia"/>
-        <w:color w:val="FF0000"/>
-        <w:sz w:val="18"/>
-        <w:szCs w:val="18"/>
-      </w:rPr>
-      <w:t>주소만</w:t>
-    </w:r>
-    <w:r>
-      <w:rPr>
-        <w:rFonts w:hint="eastAsia"/>
-        <w:color w:val="FF0000"/>
-        <w:sz w:val="18"/>
-        <w:szCs w:val="18"/>
-      </w:rPr>
-      <w:t xml:space="preserve"> </w:t>
-    </w:r>
-    <w:r>
-      <w:rPr>
-        <w:rFonts w:hint="eastAsia"/>
-        <w:color w:val="FF0000"/>
-        <w:sz w:val="18"/>
-        <w:szCs w:val="18"/>
-      </w:rPr>
-      <w:t>변경</w:t>
-    </w:r>
-    <w:r>
-      <w:rPr>
-        <w:color w:val="FF0000"/>
-        <w:sz w:val="18"/>
-        <w:szCs w:val="18"/>
-      </w:rPr>
-      <w:t>]</w:t>
+      <w:t>*발표자(leedohoun@kw.ac.kr), #교신저자(leedohoun@kw.ac.kr)</w:t>
     </w:r>
   </w:p>
 </w:ftr>

</xml_diff>